<commit_message>
Update manuscript workflow, model mechanism figures and author information
</commit_message>
<xml_diff>
--- a/model/current_results/publication/documents/supplementary_material.docx
+++ b/model/current_results/publication/documents/supplementary_material.docx
@@ -36,6 +36,18 @@
           <w:vertAlign w:val="superscript"/>
         </w:rPr>
         <w:t>2,†</w:t>
+      </w:r>
+      <w:r>
+        <w:t xml:space="preserve">, </w:t>
+      </w:r>
+      <w:r>
+        <w:t>Linchao Li</w:t>
+      </w:r>
+      <w:r>
+        <w:rPr>
+          <w:vertAlign w:val="superscript"/>
+        </w:rPr>
+        <w:t>3</w:t>
       </w:r>
       <w:r>
         <w:t xml:space="preserve">, </w:t>
@@ -102,6 +114,21 @@
       </w:r>
       <w:r>
         <w:t xml:space="preserve"> State Key Laboratory of Soil and Water Conservation and Desertification Control, College of Soil and Water Conservation Science and Engineering, Northwest A&amp;F University, Yangling, Shaanxi 712100, China</w:t>
+      </w:r>
+    </w:p>
+    <w:p>
+      <w:pPr>
+        <w:keepNext/>
+        <w:spacing w:line="480" w:lineRule="auto"/>
+      </w:pPr>
+      <w:r>
+        <w:rPr>
+          <w:vertAlign w:val="superscript"/>
+        </w:rPr>
+        <w:t>3</w:t>
+      </w:r>
+      <w:r>
+        <w:t xml:space="preserve"> College of Agronomy, Inner Mongolia Agricultural University, Hohhot, 010019, China</w:t>
       </w:r>
     </w:p>
     <w:p>
@@ -3522,25 +3549,7 @@
         </m:box>
       </m:oMath>
       <w:r>
-        <w:t xml:space="preserve"> of 0.045 g grain⁻¹ for wheat and 0.300 g grain⁻¹ for maize </w:t>
-      </w:r>
-      <w:r>
-        <w:fldChar w:fldCharType="begin"/>
-      </w:r>
-      <w:r>
-        <w:instrText xml:space="preserve"> ADDIN ZOTERO_ITEM CSL_CITATION {"citationID":"30c431ebca605f1a","properties":{"formattedCitation":"(APSIM Initiative, 2026)","plainCitation":"(APSIM Initiative, 2026)","noteIndex":0},"citationItems":[{"id":"apsim_ng_source_2026","itemData":{"id":"apsim_ng_source_2026","type":"software","title":"APSIM Next Generation (ApsimX): wheat and maize model definitions","author":[{"literal":"APSIM Initiative"}],"issued":{"date-parts":[[2026,10,1]]},"version":"074d15f51889a386d3667acfed184d03e4e8f65f","publisher":"APSIM Initiative","URL":"https://github.com/APSIMInitiative/ApsimX/tree/074d15f51889a386d3667acfed184d03e4e8f65f/Models/Resources","accessed":{"date-parts":[[2026,10,4]]},"note":"Version date is the upstream commit date, not the original date of trait estimation. Models/Resources/Wheat.json and Maize.json are byte-identical to the frozen parameter sources. Wheat SHA-256: c3dab36b40dcd205d04e4b7494f8faa3a71bd3c596cd7c40f5a9e86ed0b353aa; maize SHA-256: caa9c213c23d7843c4648d2b486412210d29e1c86b9d6f13ba083b26ca0c7e9a. Trait values are conditional model priors, rather than regional observations."}}],"schema":"https://github.com/citation-style-language/schema/raw/master/csl-citation.json"} </w:instrText>
-      </w:r>
-      <w:r>
-        <w:fldChar w:fldCharType="separate"/>
-      </w:r>
-      <w:r>
-        <w:t>(APSIM Initiative, 2026)</w:t>
-      </w:r>
-      <w:r>
-        <w:fldChar w:fldCharType="end"/>
-      </w:r>
-      <w:r>
-        <w:t>. Assimilate supply and development-dependent filling capacity constrain grain accumulation. Wheat remobilization transfers an explicit subset of stem mass to grain while conserving total aboveground mass. Live and dead leaves, stems and grain remain in the aboveground carbon pool; observed yield or harvest index does not initialize grain.</w:t>
+        <w:t xml:space="preserve"> of 0.045 g grain⁻¹ for wheat and 0.300 g grain⁻¹ for maize. Assimilate supply and development-dependent filling capacity constrain grain accumulation. Wheat remobilization transfers an explicit subset of stem mass to grain while conserving total aboveground mass. Live and dead leaves, stems and grain remain in the aboveground carbon pool; observed yield or harvest index does not initialize grain.</w:t>
       </w:r>
     </w:p>
     <w:p>
@@ -4076,7 +4085,7 @@
         <w:fldChar w:fldCharType="begin"/>
       </w:r>
       <w:r>
-        <w:instrText xml:space="preserve"> ADDIN ZOTERO_ITEM CSL_CITATION {"citationID":"801a2aa7a4c14e3e","properties":{"formattedCitation":"(Allen et al., 1998)","plainCitation":"(Allen et al., 1998)","noteIndex":0},"citationItems":[{"id":"allen1998_fao56","itemData":{"id":"allen1998_fao56","type":"book","title":"Crop evapotranspiration: Guidelines for computing crop water requirements","author":[{"family":"Allen","given":"Richard G."},{"family":"Pereira","given":"Luis S."},{"family":"Raes","given":"Dirk"},{"family":"Smith","given":"Martin"}],"issued":{"date-parts":[[1998]]},"publisher":"Food and Agriculture Organization of the United Nations","publisher-place":"Rome","collection-title":"FAO Irrigation and Drainage Paper","number":"56","ISBN":"92-5-104219-5","URL":"https://www.fao.org/4/x0490e/x0490e00.htm","accessed":{"date-parts":[[2026,10,4]]}}}],"schema":"https://github.com/citation-style-language/schema/raw/master/csl-citation.json"} </w:instrText>
+        <w:instrText xml:space="preserve"> ADDIN ZOTERO_ITEM CSL_CITATION {"citationID":"9aeaf24a0ecf2d61","properties":{"formattedCitation":"(Allen et al., 1998)","plainCitation":"(Allen et al., 1998)","noteIndex":0},"citationItems":[{"id":"allen1998_fao56","itemData":{"id":"allen1998_fao56","type":"book","title":"Crop evapotranspiration: Guidelines for computing crop water requirements","author":[{"family":"Allen","given":"Richard G."},{"family":"Pereira","given":"Luis S."},{"family":"Raes","given":"Dirk"},{"family":"Smith","given":"Martin"}],"issued":{"date-parts":[[1998]]},"publisher":"Food and Agriculture Organization of the United Nations","publisher-place":"Rome","collection-title":"FAO Irrigation and Drainage Paper","number":"56","ISBN":"92-5-104219-5","URL":"https://www.fao.org/4/x0490e/x0490e00.htm","accessed":{"date-parts":[[2026,10,4]]}}}],"schema":"https://github.com/citation-style-language/schema/raw/master/csl-citation.json"} </w:instrText>
       </w:r>
       <w:r>
         <w:fldChar w:fldCharType="separate"/>
@@ -4886,7 +4895,7 @@
         <w:fldChar w:fldCharType="begin"/>
       </w:r>
       <w:r>
-        <w:instrText xml:space="preserve"> ADDIN ZOTERO_ITEM CSL_CITATION {"citationID":"44af5ebcc024506b","properties":{"formattedCitation":"(Allen et al., 1998)","plainCitation":"(Allen et al., 1998)","noteIndex":0},"citationItems":[{"id":"allen1998_fao56","itemData":{"id":"allen1998_fao56","type":"book","title":"Crop evapotranspiration: Guidelines for computing crop water requirements","author":[{"family":"Allen","given":"Richard G."},{"family":"Pereira","given":"Luis S."},{"family":"Raes","given":"Dirk"},{"family":"Smith","given":"Martin"}],"issued":{"date-parts":[[1998]]},"publisher":"Food and Agriculture Organization of the United Nations","publisher-place":"Rome","collection-title":"FAO Irrigation and Drainage Paper","number":"56","ISBN":"92-5-104219-5","URL":"https://www.fao.org/4/x0490e/x0490e00.htm","accessed":{"date-parts":[[2026,10,4]]}}}],"schema":"https://github.com/citation-style-language/schema/raw/master/csl-citation.json"} </w:instrText>
+        <w:instrText xml:space="preserve"> ADDIN ZOTERO_ITEM CSL_CITATION {"citationID":"ee2f1b2a89420012","properties":{"formattedCitation":"(Allen et al., 1998)","plainCitation":"(Allen et al., 1998)","noteIndex":0},"citationItems":[{"id":"allen1998_fao56","itemData":{"id":"allen1998_fao56","type":"book","title":"Crop evapotranspiration: Guidelines for computing crop water requirements","author":[{"family":"Allen","given":"Richard G."},{"family":"Pereira","given":"Luis S."},{"family":"Raes","given":"Dirk"},{"family":"Smith","given":"Martin"}],"issued":{"date-parts":[[1998]]},"publisher":"Food and Agriculture Organization of the United Nations","publisher-place":"Rome","collection-title":"FAO Irrigation and Drainage Paper","number":"56","ISBN":"92-5-104219-5","URL":"https://www.fao.org/4/x0490e/x0490e00.htm","accessed":{"date-parts":[[2026,10,4]]}}}],"schema":"https://github.com/citation-style-language/schema/raw/master/csl-citation.json"} </w:instrText>
       </w:r>
       <w:r>
         <w:fldChar w:fldCharType="separate"/>
@@ -5956,7 +5965,7 @@
         <w:fldChar w:fldCharType="begin"/>
       </w:r>
       <w:r>
-        <w:instrText xml:space="preserve"> ADDIN ZOTERO_ITEM CSL_CITATION {"citationID":"21f2a16a962141f0","properties":{"formattedCitation":"(van Genuchten, 1980)","plainCitation":"(van Genuchten, 1980)","noteIndex":0},"citationItems":[{"id":"vangenuchten1980","itemData":{"id":"vangenuchten1980","type":"article-journal","title":"A Closed‐form Equation for Predicting the Hydraulic Conductivity of Unsaturated Soils","author":[{"given":"M. Th.","family":"van Genuchten"}],"issued":{"date-parts":[[1980,9]]},"container-title":"Soil Science Society of America Journal","volume":"44","issue":"5","page":"892-898","DOI":"10.2136/sssaj1980.03615995004400050002x","URL":"https://doi.org/10.2136/sssaj1980.03615995004400050002x"}}],"schema":"https://github.com/citation-style-language/schema/raw/master/csl-citation.json"} </w:instrText>
+        <w:instrText xml:space="preserve"> ADDIN ZOTERO_ITEM CSL_CITATION {"citationID":"0eeaf614ecd0c0e8","properties":{"formattedCitation":"(van Genuchten, 1980)","plainCitation":"(van Genuchten, 1980)","noteIndex":0},"citationItems":[{"id":"vangenuchten1980","itemData":{"id":"vangenuchten1980","type":"article-journal","title":"A Closed‐form Equation for Predicting the Hydraulic Conductivity of Unsaturated Soils","author":[{"given":"M. Th.","family":"van Genuchten"}],"issued":{"date-parts":[[1980,9]]},"container-title":"Soil Science Society of America Journal","volume":"44","issue":"5","page":"892-898","DOI":"10.2136/sssaj1980.03615995004400050002x","URL":"https://doi.org/10.2136/sssaj1980.03615995004400050002x"}}],"schema":"https://github.com/citation-style-language/schema/raw/master/csl-citation.json"} </w:instrText>
       </w:r>
       <w:r>
         <w:fldChar w:fldCharType="separate"/>
@@ -6285,7 +6294,7 @@
         <w:fldChar w:fldCharType="begin"/>
       </w:r>
       <w:r>
-        <w:instrText xml:space="preserve"> ADDIN ZOTERO_ITEM CSL_CITATION {"citationID":"9bf02d8c96ac3841","properties":{"formattedCitation":"(Mualem, 1976; van Genuchten, 1980)","plainCitation":"(Mualem, 1976; van Genuchten, 1980)","noteIndex":0},"citationItems":[{"id":"mualem1976","itemData":{"id":"mualem1976","type":"article-journal","title":"A new model for predicting the hydraulic conductivity of unsaturated porous media","author":[{"given":"Yechezkel","family":"Mualem"}],"issued":{"date-parts":[[1976,6]]},"container-title":"Water Resources Research","volume":"12","issue":"3","page":"513-522","DOI":"10.1029/wr012i003p00513","URL":"https://doi.org/10.1029/wr012i003p00513"}},{"id":"vangenuchten1980","itemData":{"id":"vangenuchten1980","type":"article-journal","title":"A Closed‐form Equation for Predicting the Hydraulic Conductivity of Unsaturated Soils","author":[{"given":"M. Th.","family":"van Genuchten"}],"issued":{"date-parts":[[1980,9]]},"container-title":"Soil Science Society of America Journal","volume":"44","issue":"5","page":"892-898","DOI":"10.2136/sssaj1980.03615995004400050002x","URL":"https://doi.org/10.2136/sssaj1980.03615995004400050002x"}}],"schema":"https://github.com/citation-style-language/schema/raw/master/csl-citation.json"} </w:instrText>
+        <w:instrText xml:space="preserve"> ADDIN ZOTERO_ITEM CSL_CITATION {"citationID":"d0a50fca5ec29a08","properties":{"formattedCitation":"(Mualem, 1976; van Genuchten, 1980)","plainCitation":"(Mualem, 1976; van Genuchten, 1980)","noteIndex":0},"citationItems":[{"id":"mualem1976","itemData":{"id":"mualem1976","type":"article-journal","title":"A new model for predicting the hydraulic conductivity of unsaturated porous media","author":[{"given":"Yechezkel","family":"Mualem"}],"issued":{"date-parts":[[1976,6]]},"container-title":"Water Resources Research","volume":"12","issue":"3","page":"513-522","DOI":"10.1029/wr012i003p00513","URL":"https://doi.org/10.1029/wr012i003p00513"}},{"id":"vangenuchten1980","itemData":{"id":"vangenuchten1980","type":"article-journal","title":"A Closed‐form Equation for Predicting the Hydraulic Conductivity of Unsaturated Soils","author":[{"given":"M. Th.","family":"van Genuchten"}],"issued":{"date-parts":[[1980,9]]},"container-title":"Soil Science Society of America Journal","volume":"44","issue":"5","page":"892-898","DOI":"10.2136/sssaj1980.03615995004400050002x","URL":"https://doi.org/10.2136/sssaj1980.03615995004400050002x"}}],"schema":"https://github.com/citation-style-language/schema/raw/master/csl-citation.json"} </w:instrText>
       </w:r>
       <w:r>
         <w:fldChar w:fldCharType="separate"/>
@@ -8156,7 +8165,7 @@
         <w:fldChar w:fldCharType="begin"/>
       </w:r>
       <w:r>
-        <w:instrText xml:space="preserve"> ADDIN ZOTERO_ITEM CSL_CITATION {"citationID":"2616e53776000b7a","properties":{"formattedCitation":"(Wu et al., 2023)","plainCitation":"(Wu et al., 2023)","noteIndex":0},"citationItems":[{"id":"wu2023_vadose_zone","itemData":{"id":"wu2023_vadose_zone","type":"article-journal","title":"Monitoring of Thick Vadose Zone Water Dynamics Under Irrigation Using a 48 m Deep Caisson at the Luancheng Critical Zone Observatory","author":[{"family":"Wu","given":"Lin"},{"family":"Min","given":"Leilei"},{"family":"Liu","given":"Meiying"},{"family":"Zhang","given":"Yucui"},{"family":"Pei","given":"Hongwei"},{"family":"Li","given":"Hongjun"},{"family":"Zhang","given":"Guanglu"},{"family":"Wang","given":"Shiqin"},{"family":"Shen","given":"Yanjun"}],"issued":{"date-parts":[[2023,5]]},"container-title":"Water Resources Research","container-title-short":"Water Resour. Res.","volume":"59","DOI":"10.1029/2022wr032965","URL":"https://doi.org/10.1029/2022wr032965","accessed":{"date-parts":[[2026,10,3]]},"language":"en","publisher":"American Geophysical Union (AGU)","issue":"5","page":"e2022WR032965"}}],"schema":"https://github.com/citation-style-language/schema/raw/master/csl-citation.json"} </w:instrText>
+        <w:instrText xml:space="preserve"> ADDIN ZOTERO_ITEM CSL_CITATION {"citationID":"84199689fcb4e454","properties":{"formattedCitation":"(Wu et al., 2023)","plainCitation":"(Wu et al., 2023)","noteIndex":0},"citationItems":[{"id":"wu2023_vadose_zone","itemData":{"id":"wu2023_vadose_zone","type":"article-journal","title":"Monitoring of Thick Vadose Zone Water Dynamics Under Irrigation Using a 48 m Deep Caisson at the Luancheng Critical Zone Observatory","author":[{"family":"Wu","given":"Lin"},{"family":"Min","given":"Leilei"},{"family":"Liu","given":"Meiying"},{"family":"Zhang","given":"Yucui"},{"family":"Pei","given":"Hongwei"},{"family":"Li","given":"Hongjun"},{"family":"Zhang","given":"Guanglu"},{"family":"Wang","given":"Shiqin"},{"family":"Shen","given":"Yanjun"}],"issued":{"date-parts":[[2023,5]]},"container-title":"Water Resources Research","container-title-short":"Water Resour. Res.","volume":"59","DOI":"10.1029/2022wr032965","URL":"https://doi.org/10.1029/2022wr032965","accessed":{"date-parts":[[2026,10,3]]},"language":"en","publisher":"American Geophysical Union (AGU)","issue":"5","page":"e2022WR032965"}}],"schema":"https://github.com/citation-style-language/schema/raw/master/csl-citation.json"} </w:instrText>
       </w:r>
       <w:r>
         <w:fldChar w:fldCharType="separate"/>
@@ -8191,7 +8200,7 @@
         <w:fldChar w:fldCharType="begin"/>
       </w:r>
       <w:r>
-        <w:instrText xml:space="preserve"> ADDIN ZOTERO_ITEM CSL_CITATION {"citationID":"5da6ae2fef7608bd","properties":{"formattedCitation":"(Saxton and Rawls, 2006)","plainCitation":"(Saxton and Rawls, 2006)","noteIndex":0},"citationItems":[{"id":"saxton2006_hydraulics","itemData":{"id":"saxton2006_hydraulics","type":"article-journal","title":"Soil Water Characteristic Estimates by Texture and Organic Matter for Hydrologic Solutions","author":[{"family":"Saxton","given":"K. E."},{"family":"Rawls","given":"W. J."}],"container-title":"Soil Science Society of America Journal","volume":"70","issue":"5","page":"1569-1578","issued":{"date-parts":[[2006,9,1]]},"accessed":{"date-parts":[[2026,10,3]]},"DOI":"10.2136/sssaj2005.0117","URL":"https://acsess.onlinelibrary.wiley.com/doi/10.2136/sssaj2005.0117","note":"Publisher title/authors/date/volume/issue/pages and Crossref DOI metadata verified 2026-10-03. Publisher publication date2006-09-01; Crossref records2006-09. Source supports texture/organic-matter pedotransfer estimates, not verified site-specific hydraulic measurements."}}],"schema":"https://github.com/citation-style-language/schema/raw/master/csl-citation.json"} </w:instrText>
+        <w:instrText xml:space="preserve"> ADDIN ZOTERO_ITEM CSL_CITATION {"citationID":"65bca87b1107d3fb","properties":{"formattedCitation":"(Saxton and Rawls, 2006)","plainCitation":"(Saxton and Rawls, 2006)","noteIndex":0},"citationItems":[{"id":"saxton2006_hydraulics","itemData":{"id":"saxton2006_hydraulics","type":"article-journal","title":"Soil Water Characteristic Estimates by Texture and Organic Matter for Hydrologic Solutions","author":[{"family":"Saxton","given":"K. E."},{"family":"Rawls","given":"W. J."}],"container-title":"Soil Science Society of America Journal","volume":"70","issue":"5","page":"1569-1578","issued":{"date-parts":[[2006,9,1]]},"accessed":{"date-parts":[[2026,10,3]]},"DOI":"10.2136/sssaj2005.0117","URL":"https://acsess.onlinelibrary.wiley.com/doi/10.2136/sssaj2005.0117","note":"Publisher title/authors/date/volume/issue/pages and Crossref DOI metadata verified 2026-10-03. Publisher publication date2006-09-01; Crossref records2006-09. Source supports texture/organic-matter pedotransfer estimates, not verified site-specific hydraulic measurements."}}],"schema":"https://github.com/citation-style-language/schema/raw/master/csl-citation.json"} </w:instrText>
       </w:r>
       <w:r>
         <w:fldChar w:fldCharType="separate"/>
@@ -8296,7 +8305,7 @@
         <w:fldChar w:fldCharType="begin"/>
       </w:r>
       <w:r>
-        <w:instrText xml:space="preserve"> ADDIN ZOTERO_ITEM CSL_CITATION {"citationID":"8b66121c6696cf80","properties":{"formattedCitation":"(ISRIC — World Soil Information, 2020)","plainCitation":"(ISRIC — World Soil Information, 2020)","noteIndex":0},"citationItems":[{"id":"soilgrids2020_dataset","itemData":{"id":"soilgrids2020_dataset","type":"dataset","title":"SoilGrids250m version 2.0","author":[{"literal":"ISRIC — World Soil Information"}],"issued":{"date-parts":[[2020]]},"URL":"https://docs.isric.org/globaldata/soilgrids/SoilGrids_faqs.html"}}],"schema":"https://github.com/citation-style-language/schema/raw/master/csl-citation.json"} </w:instrText>
+        <w:instrText xml:space="preserve"> ADDIN ZOTERO_ITEM CSL_CITATION {"citationID":"90f58b664885a93f","properties":{"formattedCitation":"(ISRIC — World Soil Information, 2020)","plainCitation":"(ISRIC — World Soil Information, 2020)","noteIndex":0},"citationItems":[{"id":"soilgrids2020_dataset","itemData":{"id":"soilgrids2020_dataset","type":"dataset","title":"SoilGrids250m version 2.0","author":[{"literal":"ISRIC — World Soil Information"}],"issued":{"date-parts":[[2020]]},"URL":"https://docs.isric.org/globaldata/soilgrids/SoilGrids_faqs.html"}}],"schema":"https://github.com/citation-style-language/schema/raw/master/csl-citation.json"} </w:instrText>
       </w:r>
       <w:r>
         <w:fldChar w:fldCharType="separate"/>
@@ -10369,7 +10378,7 @@
         <w:fldChar w:fldCharType="begin"/>
       </w:r>
       <w:r>
-        <w:instrText xml:space="preserve"> ADDIN ZOTERO_ITEM CSL_CITATION {"citationID":"fbb66f3bf690a4fd","properties":{"formattedCitation":"(NASA JPL, 2013)","plainCitation":"(NASA JPL, 2013)","noteIndex":0},"citationItems":[{"id":"srtm","itemData":{"id":"srtm","type":"dataset","title":"NASA Shuttle Radar Topography Mission Global 1 arc second","author":[{"literal":"NASA JPL"}],"issued":{"date-parts":[[2013]]},"DOI":"10.5067/MEASURES/SRTM/SRTMGL1.003","URL":"https://www.earthdata.nasa.gov/data/catalog/lpcloud-srtmgl1-003","publisher":"NASA Land Processes Distributed Active Archive Center"}}],"schema":"https://github.com/citation-style-language/schema/raw/master/csl-citation.json"} </w:instrText>
+        <w:instrText xml:space="preserve"> ADDIN ZOTERO_ITEM CSL_CITATION {"citationID":"5b2d8856ddec92dc","properties":{"formattedCitation":"(NASA JPL, 2013)","plainCitation":"(NASA JPL, 2013)","noteIndex":0},"citationItems":[{"id":"srtm","itemData":{"id":"srtm","type":"dataset","title":"NASA Shuttle Radar Topography Mission Global 1 arc second","author":[{"literal":"NASA JPL"}],"issued":{"date-parts":[[2013]]},"DOI":"10.5067/MEASURES/SRTM/SRTMGL1.003","URL":"https://www.earthdata.nasa.gov/data/catalog/lpcloud-srtmgl1-003","publisher":"NASA Land Processes Distributed Active Archive Center"}}],"schema":"https://github.com/citation-style-language/schema/raw/master/csl-citation.json"} </w:instrText>
       </w:r>
       <w:r>
         <w:fldChar w:fldCharType="separate"/>
@@ -10395,7 +10404,7 @@
         <w:fldChar w:fldCharType="begin"/>
       </w:r>
       <w:r>
-        <w:instrText xml:space="preserve"> ADDIN ZOTERO_ITEM CSL_CITATION {"citationID":"77290f3bd20b59cc","properties":{"formattedCitation":"(Qiu et al., 2022)","plainCitation":"(Qiu et al., 2022)","noteIndex":0},"citationItems":[{"id":"chinacp2022","itemData":{"id":"chinacp2022","type":"journal-article","title":"Maps of cropping patterns in China during 2015–2021","author":[{"given":"Bingwen","family":"Qiu"},{"given":"Xiang","family":"Hu"},{"given":"Chongcheng","family":"Chen"},{"given":"Zhenghong","family":"Tang"},{"given":"Peng","family":"Yang"},{"given":"Xiaolin","family":"Zhu"},{"given":"Chao","family":"Yan"},{"given":"Zeyu","family":"Jian"}],"issued":{"date-parts":[[2022,8,5]]},"container-title":"Scientific Data","volume":"9","issue":"1","article-number":"479","DOI":"10.1038/s41597-022-01589-8","URL":"http://dx.doi.org/10.1038/s41597-022-01589-8","publisher":"Springer Science and Business Media LLC","page":"479"}}],"schema":"https://github.com/citation-style-language/schema/raw/master/csl-citation.json"} </w:instrText>
+        <w:instrText xml:space="preserve"> ADDIN ZOTERO_ITEM CSL_CITATION {"citationID":"33fb0d79498c7d82","properties":{"formattedCitation":"(Qiu et al., 2022)","plainCitation":"(Qiu et al., 2022)","noteIndex":0},"citationItems":[{"id":"chinacp2022","itemData":{"id":"chinacp2022","type":"journal-article","title":"Maps of cropping patterns in China during 2015–2021","author":[{"given":"Bingwen","family":"Qiu"},{"given":"Xiang","family":"Hu"},{"given":"Chongcheng","family":"Chen"},{"given":"Zhenghong","family":"Tang"},{"given":"Peng","family":"Yang"},{"given":"Xiaolin","family":"Zhu"},{"given":"Chao","family":"Yan"},{"given":"Zeyu","family":"Jian"}],"issued":{"date-parts":[[2022,8,5]]},"container-title":"Scientific Data","volume":"9","issue":"1","article-number":"479","DOI":"10.1038/s41597-022-01589-8","URL":"http://dx.doi.org/10.1038/s41597-022-01589-8","publisher":"Springer Science and Business Media LLC","page":"479"}}],"schema":"https://github.com/citation-style-language/schema/raw/master/csl-citation.json"} </w:instrText>
       </w:r>
       <w:r>
         <w:fldChar w:fldCharType="separate"/>
@@ -10413,7 +10422,7 @@
         <w:fldChar w:fldCharType="begin"/>
       </w:r>
       <w:r>
-        <w:instrText xml:space="preserve"> ADDIN ZOTERO_ITEM CSL_CITATION {"citationID":"1f33d7b8119c6105","properties":{"formattedCitation":"(Fu et al., 2026; Fu et al., 2025)","plainCitation":"(Fu et al., 2026; Fu et al., 2025)","noteIndex":0},"citationItems":[{"id":"fu2025_ccd_dataset","itemData":{"id":"fu2025_ccd_dataset","type":"dataset","title":"China Crop Dataset: A long-term and high-resolution crop distribution dataset in China","author":[{"given":"Yangyang","family":"Fu"},{"given":"Jie","family":"Dong"},{"given":"Ruoque","family":"Shen"},{"given":"Qiongyan","family":"Peng"},{"given":"Xiangqian","family":"Li"},{"given":"Yi","family":"Zheng"},{"given":"Baihong","family":"Pan"},{"given":"Jinwei","family":"Dong"},{"given":"Bingwen","family":"Qiu"},{"given":"Jianxi","family":"Huang"},{"given":"Wenping","family":"Yuan"}],"issued":{"date-parts":[[2025,11,28]]},"accessed":{"date-parts":[[2026,10,4]]},"publisher":"Science Data Bank","version":"1.0.0 (repository citationV1)","DOI":"10.57760/sciencedb.32361","URL":"https://doi.org/10.57760/sciencedb.32361","note":"Datasetidentityverifiedfromexistingofficialrepositorymetadata.30mChinaCropDataset2001–2024;class9=winterwheat–maizerotation. The2020layerincomparisonispartofthisdataset,notCCD-Maize-only. Snapshot CCD_repository_metadata.json SHA-256 205dbd2ca8692b8ff4605df6ae110d71b0ff5a2a6aef9bb3052bcb3e8c34912e."}},{"id":"fu2026_ccd_descriptor","itemData":{"id":"fu2026_ccd_descriptor","type":"article-journal","title":"A 30-m annual distribution dataset of major crops in China from 2001-2024","author":[{"family":"Fu","given":"Yangyang"},{"family":"Dong","given":"Jie"},{"family":"Shen","given":"Ruoque"},{"family":"Peng","given":"Qiongyan"},{"family":"Li","given":"Xiangqian"},{"family":"Zheng","given":"Yi"},{"family":"Pan","given":"Baihong"},{"family":"Dong","given":"Jinwei"},{"family":"Qiu","given":"Bingwen"},{"family":"Huang","given":"Jianxi"},{"family":"Huang","given":"Xiaojuan"},{"family":"Yuan","given":"Wenping"}],"issued":{"date-parts":[[2026,5,11]]},"accessed":{"date-parts":[[2026,10,4]]},"container-title":"Scientific Data","volume":"13","issue":"1","page":"1074","DOI":"10.1038/s41597-026-07370-5","URL":"https://www.nature.com/articles/s41597-026-07370-5","note":"PublishedNature-familyDataDescriptorverifiedfromexistingpublisherHTMLcitationmetadata;DataRecordsidentifiessameScienceDataBankdataset. Snapshot CCD2026_Nature_publisher.html SHA-256 b93d7b665293aa3d8393bfb50b187c9c1cc756e2ba00f6bd46c1f628d7871c20."}}],"schema":"https://github.com/citation-style-language/schema/raw/master/csl-citation.json"} </w:instrText>
+        <w:instrText xml:space="preserve"> ADDIN ZOTERO_ITEM CSL_CITATION {"citationID":"1eb6224f3e122e7c","properties":{"formattedCitation":"(Fu et al., 2026; Fu et al., 2025)","plainCitation":"(Fu et al., 2026; Fu et al., 2025)","noteIndex":0},"citationItems":[{"id":"fu2025_ccd_dataset","itemData":{"id":"fu2025_ccd_dataset","type":"dataset","title":"China Crop Dataset: A long-term and high-resolution crop distribution dataset in China","author":[{"given":"Yangyang","family":"Fu"},{"given":"Jie","family":"Dong"},{"given":"Ruoque","family":"Shen"},{"given":"Qiongyan","family":"Peng"},{"given":"Xiangqian","family":"Li"},{"given":"Yi","family":"Zheng"},{"given":"Baihong","family":"Pan"},{"given":"Jinwei","family":"Dong"},{"given":"Bingwen","family":"Qiu"},{"given":"Jianxi","family":"Huang"},{"given":"Wenping","family":"Yuan"}],"issued":{"date-parts":[[2025,11,28]]},"accessed":{"date-parts":[[2026,10,4]]},"publisher":"Science Data Bank","version":"1.0.0 (repository citationV1)","DOI":"10.57760/sciencedb.32361","URL":"https://doi.org/10.57760/sciencedb.32361","note":"Datasetidentityverifiedfromexistingofficialrepositorymetadata.30mChinaCropDataset2001–2024;class9=winterwheat–maizerotation. The2020layerincomparisonispartofthisdataset,notCCD-Maize-only. Snapshot CCD_repository_metadata.json SHA-256 205dbd2ca8692b8ff4605df6ae110d71b0ff5a2a6aef9bb3052bcb3e8c34912e."}},{"id":"fu2026_ccd_descriptor","itemData":{"id":"fu2026_ccd_descriptor","type":"article-journal","title":"A 30-m annual distribution dataset of major crops in China from 2001-2024","author":[{"family":"Fu","given":"Yangyang"},{"family":"Dong","given":"Jie"},{"family":"Shen","given":"Ruoque"},{"family":"Peng","given":"Qiongyan"},{"family":"Li","given":"Xiangqian"},{"family":"Zheng","given":"Yi"},{"family":"Pan","given":"Baihong"},{"family":"Dong","given":"Jinwei"},{"family":"Qiu","given":"Bingwen"},{"family":"Huang","given":"Jianxi"},{"family":"Huang","given":"Xiaojuan"},{"family":"Yuan","given":"Wenping"}],"issued":{"date-parts":[[2026,5,11]]},"accessed":{"date-parts":[[2026,10,4]]},"container-title":"Scientific Data","volume":"13","issue":"1","page":"1074","DOI":"10.1038/s41597-026-07370-5","URL":"https://www.nature.com/articles/s41597-026-07370-5","note":"PublishedNature-familyDataDescriptorverifiedfromexistingpublisherHTMLcitationmetadata;DataRecordsidentifiessameScienceDataBankdataset. Snapshot CCD2026_Nature_publisher.html SHA-256 b93d7b665293aa3d8393bfb50b187c9c1cc756e2ba00f6bd46c1f628d7871c20."}}],"schema":"https://github.com/citation-style-language/schema/raw/master/csl-citation.json"} </w:instrText>
       </w:r>
       <w:r>
         <w:fldChar w:fldCharType="separate"/>
@@ -18257,7 +18266,7 @@
         <w:spacing w:line="480" w:lineRule="auto"/>
       </w:pPr>
       <w:r>
-        <w:t>Figure S6. Site-specific wheat LAI comparisons: (a) Fengqiu; (b) Luancheng; (c) Shangqiu; (d) Yucheng. Calibration and retrospective-evaluation observations and simulations share the same axes within each site. Error bars describe site-year standard errors; gaps are retained. The observations, weighting and conditional management interpretation follow Figure 4.</w:t>
+        <w:t>Figure S6. Site-specific wheat LAI comparisons: (a) Fengqiu; (b) Luancheng; (c) Shangqiu; (d) Yucheng. Calibration and retrospective-evaluation observations and simulations share the same axes within each site. Error bars describe site-year standard errors; gaps are retained. The observations, weighting and conditional management interpretation follow Figure 5.</w:t>
       </w:r>
     </w:p>
     <w:p>
@@ -18308,7 +18317,7 @@
         <w:spacing w:line="480" w:lineRule="auto"/>
       </w:pPr>
       <w:r>
-        <w:t>Figure S7. Site-specific wheat aboveground biomass comparisons: (a) Fengqiu; (b) Luancheng; (c) Shangqiu; (d) Yucheng. Calibration and retrospective-evaluation observations and simulations share the same axes within each site. Error bars describe site-year standard errors; gaps are retained. The observations, weighting and conditional management interpretation follow Figure 4.</w:t>
+        <w:t>Figure S7. Site-specific wheat aboveground biomass comparisons: (a) Fengqiu; (b) Luancheng; (c) Shangqiu; (d) Yucheng. Calibration and retrospective-evaluation observations and simulations share the same axes within each site. Error bars describe site-year standard errors; gaps are retained. The observations, weighting and conditional management interpretation follow Figure 5.</w:t>
       </w:r>
     </w:p>
     <w:p>
@@ -18359,7 +18368,7 @@
         <w:spacing w:line="480" w:lineRule="auto"/>
       </w:pPr>
       <w:r>
-        <w:t>Figure S8. Site-specific wheat ET comparisons: (a) Fengqiu; (b) Yucheng. Calibration and retrospective-evaluation observations and simulations share the same axes within each site. Error bars describe site-year standard errors; gaps are retained. The observations, weighting and conditional management interpretation follow Figure 4.</w:t>
+        <w:t>Figure S8. Site-specific wheat ET comparisons: (a) Fengqiu; (b) Yucheng. Calibration and retrospective-evaluation observations and simulations share the same axes within each site. Error bars describe site-year standard errors; gaps are retained. The observations, weighting and conditional management interpretation follow Figure 5.</w:t>
       </w:r>
     </w:p>
     <w:p>
@@ -18410,7 +18419,7 @@
         <w:spacing w:line="480" w:lineRule="auto"/>
       </w:pPr>
       <w:r>
-        <w:t>Figure S9. Site-specific maize LAI comparisons: (a) Fengqiu; (b) Gucheng; (c) Luancheng; (d) Shangqiu; (e) Yucheng. Calibration and retrospective-evaluation observations and simulations share the same axes within each site. Error bars describe site-year standard errors; gaps are retained. The observations, weighting and conditional management interpretation follow Figure 4.</w:t>
+        <w:t>Figure S9. Site-specific maize LAI comparisons: (a) Fengqiu; (b) Gucheng; (c) Luancheng; (d) Shangqiu; (e) Yucheng. Calibration and retrospective-evaluation observations and simulations share the same axes within each site. Error bars describe site-year standard errors; gaps are retained. The observations, weighting and conditional management interpretation follow Figure 5.</w:t>
       </w:r>
     </w:p>
     <w:p>
@@ -18461,7 +18470,7 @@
         <w:spacing w:line="480" w:lineRule="auto"/>
       </w:pPr>
       <w:r>
-        <w:t>Figure S10. Site-specific maize aboveground biomass comparisons: (a) Fengqiu; (b) Luancheng; (c) Shangqiu; (d) Yucheng. Calibration and retrospective-evaluation observations and simulations share the same axes within each site. Error bars describe site-year standard errors; gaps are retained. The observations, weighting and conditional management interpretation follow Figure 4.</w:t>
+        <w:t>Figure S10. Site-specific maize aboveground biomass comparisons: (a) Fengqiu; (b) Luancheng; (c) Shangqiu; (d) Yucheng. Calibration and retrospective-evaluation observations and simulations share the same axes within each site. Error bars describe site-year standard errors; gaps are retained. The observations, weighting and conditional management interpretation follow Figure 5.</w:t>
       </w:r>
     </w:p>
     <w:p>
@@ -18512,7 +18521,7 @@
         <w:spacing w:line="480" w:lineRule="auto"/>
       </w:pPr>
       <w:r>
-        <w:t>Figure S11. Site-specific maize ET comparisons: (a) Fengqiu; (b) Yucheng. Calibration and retrospective-evaluation observations and simulations share the same axes within each site. Error bars describe site-year standard errors; gaps are retained. The observations, weighting and conditional management interpretation follow Figure 4.</w:t>
+        <w:t>Figure S11. Site-specific maize ET comparisons: (a) Fengqiu; (b) Yucheng. Calibration and retrospective-evaluation observations and simulations share the same axes within each site. Error bars describe site-year standard errors; gaps are retained. The observations, weighting and conditional management interpretation follow Figure 5.</w:t>
       </w:r>
     </w:p>
     <w:p>

</xml_diff>

<commit_message>
Finalize latest paper documents and clean repository artifacts
</commit_message>
<xml_diff>
--- a/model/current_results/publication/documents/supplementary_material.docx
+++ b/model/current_results/publication/documents/supplementary_material.docx
@@ -137,7 +137,7 @@
         <w:spacing w:line="480" w:lineRule="auto"/>
       </w:pPr>
       <w:r>
-        <w:t>† Linjia Yao and Bin Chen contributed equally to this work and share first authorship.</w:t>
+        <w:t>† Linjia Yao and Bin Chen contributed equally.</w:t>
       </w:r>
     </w:p>
     <w:p>
@@ -172,6 +172,130 @@
         <w:spacing w:line="480" w:lineRule="auto"/>
       </w:pPr>
       <w:r>
+        <w:t xml:space="preserve">Fengqiu, Luancheng and Shangqiu crop phenology, leaf area and biomass records were obtained from the station growth-monitoring datasets </w:t>
+      </w:r>
+      <w:r>
+        <w:fldChar w:fldCharType="begin"/>
+      </w:r>
+      <w:r>
+        <w:instrText xml:space="preserve"> ADDIN ZOTERO_ITEM CSL_CITATION {"citationID":"3bc6dc72920427be","properties":{"formattedCitation":"(Fengqiu Station, 2020a; Luancheng Station, 2020; Shangqiu Station, 2021)","plainCitation":"(Fengqiu Station, 2020a; Luancheng Station, 2020; Shangqiu Station, 2021)","noteIndex":0},"citationItems":[{"id":"fengqiu2020_crop","itemData":{"id":"fengqiu2020_crop","type":"dataset","title":"Crop phenology and growth dynamics at Fengqiu Station, Henan Province, 2004–2008","author":[{"literal":"Fengqiu Station"}],"issued":{"date-parts":[[2020]]},"publisher":"National Ecosystem Science Data Center","version":"v1","DOI":"10.12199/nesdc.ecodb.mon.2020.dp2011.fqa.002","URL":"https://doi.org/10.12199/nesdc.ecodb.mon.2020.dp2011.fqa.002","accessed":{"date-parts":[[2026,10,8]]},"language":"zh","note":"Dataset. Original creator: 河南封丘站. Original title: 2004-2008年河南封丘站作物生育及生长动态监测数据. Version v1. English title follows the official Gucheng title or translates the original Chinese station title."}},{"id":"luancheng2020_crop","itemData":{"id":"luancheng2020_crop","type":"dataset","title":"Crop phenology and growth dynamics at Luancheng Station, Hebei Province, 2000–2008","author":[{"literal":"Luancheng Station"}],"issued":{"date-parts":[[2020]]},"publisher":"National Ecosystem Science Data Center","version":"v1","DOI":"10.12199/nesdc.ecodb.mon.2020.dp2011.lca.002","URL":"https://doi.org/10.12199/nesdc.ecodb.mon.2020.dp2011.lca.002","accessed":{"date-parts":[[2026,10,8]]},"language":"zh","note":"Dataset. Original creator: 河北栾城站. Original title: 2000-2008年河北栾城站作物生育及生长动态监测数据. Version v1. English title follows the official Gucheng title or translates the original Chinese station title."}},{"id":"shangqiu2021_crop","itemData":{"id":"shangqiu2021_crop","type":"dataset","title":"Crop phenology and growth dynamics at Shangqiu Station, Henan Province, 2000–2007","author":[{"literal":"Shangqiu Station"}],"issued":{"date-parts":[[2021]]},"publisher":"National Ecosystem Science Data Center","version":"v1","DOI":"10.12199/nesdc.ecodb.mon.2020.dp2011.sqa.003","URL":"https://doi.org/10.12199/nesdc.ecodb.mon.2020.dp2011.sqa.003","accessed":{"date-parts":[[2026,10,8]]},"language":"zh","note":"Dataset. Original creator: 河南商丘站. Original title: 2000-2007年河南商丘站作物生育及生长动态监测数据. Version v1. English title follows the official Gucheng title or translates the original Chinese station title."}}],"schema":"https://github.com/citation-style-language/schema/raw/master/csl-citation.json"} </w:instrText>
+      </w:r>
+      <w:r>
+        <w:fldChar w:fldCharType="separate"/>
+      </w:r>
+      <w:r>
+        <w:t>(Fengqiu Station, 2020a; Luancheng Station, 2020; Shangqiu Station, 2021)</w:t>
+      </w:r>
+      <w:r>
+        <w:fldChar w:fldCharType="end"/>
+      </w:r>
+      <w:r>
+        <w:t xml:space="preserve">. The Gucheng sowing-date dataset supplies maize development and LAI observations </w:t>
+      </w:r>
+      <w:r>
+        <w:fldChar w:fldCharType="begin"/>
+      </w:r>
+      <w:r>
+        <w:instrText xml:space="preserve"> ADDIN ZOTERO_ITEM CSL_CITATION {"citationID":"6f9c844bfe6d09aa","properties":{"formattedCitation":"(Geng et al., 2023)","plainCitation":"(Geng et al., 2023)","noteIndex":0},"citationItems":[{"id":"geng2023_gucheng_dataset","itemData":{"id":"geng2023_gucheng_dataset","type":"dataset","title":"A dataset of effects of different sowing dates on maize growth and development in the northern part of North China from 2018 to 2021","author":[{"family":"Geng","given":"Jinjian"},{"family":"Zhou","given":"Guangsheng"},{"family":"Song","given":"Yanling"},{"family":"Ren","given":"Sanxue"},{"family":"Zhao","given":"Huarong"},{"family":"Zhou","given":"Huailin"},{"family":"Song","given":"Xingyang"},{"family":"Tian","given":"Xiaoli"}],"issued":{"date-parts":[[2023]]},"publisher":"National Ecosystem Science Data Center","version":"V3","DOI":"10.57760/sciencedb.o00119.00017","URL":"https://doi.org/10.57760/sciencedb.o00119.00017","accessed":{"date-parts":[[2026,10,8]]},"language":"zh","note":"Dataset. Original creator: 耿金剑；周广胜；宋艳玲；任三学；赵花荣；周怀林；宋兴阳；田晓丽. Original title: 2018–2021年华北北部不同播期对玉米生长发育的影响数据集. Version V3. English title follows the official Gucheng title or translates the original Chinese station title."}}],"schema":"https://github.com/citation-style-language/schema/raw/master/csl-citation.json"} </w:instrText>
+      </w:r>
+      <w:r>
+        <w:fldChar w:fldCharType="separate"/>
+      </w:r>
+      <w:r>
+        <w:t>(Geng et al., 2023)</w:t>
+      </w:r>
+      <w:r>
+        <w:fldChar w:fldCharType="end"/>
+      </w:r>
+      <w:r>
+        <w:t xml:space="preserve">. Yucheng records combine the 1998–2006 crop archive and the 2005–2022 biological and water-environment archives </w:t>
+      </w:r>
+      <w:r>
+        <w:fldChar w:fldCharType="begin"/>
+      </w:r>
+      <w:r>
+        <w:instrText xml:space="preserve"> ADDIN ZOTERO_ITEM CSL_CITATION {"citationID":"e857d7723ab250c9","properties":{"formattedCitation":"(Yucheng Station, 2025b; Yucheng Station, 2025a; Yucheng Station, 2021)","plainCitation":"(Yucheng Station, 2025b; Yucheng Station, 2025a; Yucheng Station, 2021)","noteIndex":0},"citationItems":[{"id":"yucheng2021_crop","itemData":{"id":"yucheng2021_crop","type":"dataset","title":"Crop phenology and growth dynamics at Yucheng Station, Shandong Province, 1998–2006","author":[{"literal":"Yucheng Station"}],"issued":{"date-parts":[[2021]]},"publisher":"National Ecosystem Science Data Center","version":"v1","DOI":"10.12199/nesdc.ecodb.mon.2020.dp2011.yca.003","URL":"https://doi.org/10.12199/nesdc.ecodb.mon.2020.dp2011.yca.003","accessed":{"date-parts":[[2026,10,8]]},"language":"zh","note":"Dataset. Original creator: 山东禹城站. Original title: 1998-2006年山东禹城站作物生育及生长动态监测数据. Version v1. English title follows the official Gucheng title or translates the original Chinese station title."}},{"id":"yucheng2025_biology","itemData":{"id":"yucheng2025_biology","type":"dataset","title":"Biological observations at Yucheng Station, 2005–2022","author":[{"literal":"Yucheng Station"}],"issued":{"date-parts":[[2025]]},"publisher":"National Ecosystem Science Data Center","version":"v1","DOI":"10.12199/nesdc.ecodb.2021YFF0703900.yca.2025.2","URL":"https://doi.org/10.12199/nesdc.ecodb.2021YFF0703900.yca.2025.2","accessed":{"date-parts":[[2026,10,8]]},"language":"zh","note":"Dataset. Original creator: 山东禹城农田生态系统国家野外科学观测研究站. Original title: 禹城站2005-2022年生物要素观测数据集. Version v1. English title follows the official Gucheng title or translates the original Chinese station title."}},{"id":"yucheng2025_water","itemData":{"id":"yucheng2025_water","type":"dataset","title":"Water-environment observations at Yucheng Station, 2005–2022","author":[{"literal":"Yucheng Station"}],"issued":{"date-parts":[[2025]]},"publisher":"National Ecosystem Science Data Center","version":"v1","DOI":"10.12199/nesdc.ecodb.2021YFF0703900.yca.2025.3","URL":"https://doi.org/10.12199/nesdc.ecodb.2021YFF0703900.yca.2025.3","accessed":{"date-parts":[[2026,10,8]]},"language":"zh","note":"Dataset. Original creator: 山东禹城农田生态系统国家野外科学观测研究站. Original title: 禹城站2005-2022年水环境要素观测数据集. Version v1. English title follows the official Gucheng title or translates the original Chinese station title."}}],"schema":"https://github.com/citation-style-language/schema/raw/master/csl-citation.json"} </w:instrText>
+      </w:r>
+      <w:r>
+        <w:fldChar w:fldCharType="separate"/>
+      </w:r>
+      <w:r>
+        <w:t>(Yucheng Station, 2025b; Yucheng Station, 2025a; Yucheng Station, 2021)</w:t>
+      </w:r>
+      <w:r>
+        <w:fldChar w:fldCharType="end"/>
+      </w:r>
+      <w:r>
+        <w:t xml:space="preserve">. Fengqiu ET and antecedent soil-moisture profiles come from the farmland soil-water physical-properties archive </w:t>
+      </w:r>
+      <w:r>
+        <w:fldChar w:fldCharType="begin"/>
+      </w:r>
+      <w:r>
+        <w:instrText xml:space="preserve"> ADDIN ZOTERO_ITEM CSL_CITATION {"citationID":"21bb031b3349a93a","properties":{"formattedCitation":"(Fengqiu Station, 2020b)","plainCitation":"(Fengqiu Station, 2020b)","noteIndex":0},"citationItems":[{"id":"fengqiu2020_soil_water","itemData":{"id":"fengqiu2020_soil_water","type":"dataset","title":"Farmland soil-water physical properties at Fengqiu Station, Henan Province, 2005–2008","author":[{"literal":"Fengqiu Station"}],"issued":{"date-parts":[[2020]]},"publisher":"National Ecosystem Science Data Center","version":"v1","DOI":"10.12199/nesdc.ecodb.mon.2020.dp2011.fqa.006","URL":"https://doi.org/10.12199/nesdc.ecodb.mon.2020.dp2011.fqa.006","accessed":{"date-parts":[[2026,10,8]]},"language":"zh","note":"Dataset. Original creator: 河南封丘站. Original title: 2005-2008年河南封丘站农田土壤水分物理性质监测数据. Version v1. English title follows the official Gucheng title or translates the original Chinese station title."}}],"schema":"https://github.com/citation-style-language/schema/raw/master/csl-citation.json"} </w:instrText>
+      </w:r>
+      <w:r>
+        <w:fldChar w:fldCharType="separate"/>
+      </w:r>
+      <w:r>
+        <w:t>(Fengqiu Station, 2020b)</w:t>
+      </w:r>
+      <w:r>
+        <w:fldChar w:fldCharType="end"/>
+      </w:r>
+      <w:r>
+        <w:t>.</w:t>
+      </w:r>
+    </w:p>
+    <w:p>
+      <w:pPr>
+        <w:spacing w:line="480" w:lineRule="auto"/>
+      </w:pPr>
+      <w:r>
+        <w:t xml:space="preserve">Published crop-model evaluations used Fengqiu, Luancheng and Yucheng observations </w:t>
+      </w:r>
+      <w:r>
+        <w:fldChar w:fldCharType="begin"/>
+      </w:r>
+      <w:r>
+        <w:instrText xml:space="preserve"> ADDIN ZOTERO_ITEM CSL_CITATION {"citationID":"ac898e71ea8d261a","properties":{"formattedCitation":"(Chen et al., 2010; Yu et al., 2006)","plainCitation":"(Chen et al., 2010; Yu et al., 2006)","noteIndex":0},"citationItems":[{"id":"chen2010_crop_productivity","itemData":{"id":"chen2010_crop_productivity","type":"article-journal","title":"Modeling Wheat and Maize Productivity as Affected by Climate Variation and Irrigation Supply in North China Plain","author":[{"family":"Chen","given":"Chao"},{"family":"Wang","given":"Enli"},{"family":"Yu","given":"Qiang"}],"issued":{"date-parts":[[2010,5,1]]},"container-title":"Agronomy Journal","volume":"102","issue":"3","page":"1037-1049","DOI":"10.2134/agronj2009.0505","URL":"https://doi.org/10.2134/agronj2009.0505"}},{"id":"yu2006_rzwqm_yucheng","itemData":{"id":"yu2006_rzwqm_yucheng","type":"article-journal","title":"Modeling a wheat–maize double cropping system in China using two plant growth modules in RZWQM","author":[{"given":"Q.","family":"Yu"},{"given":"S.A.","family":"Saseendran"},{"given":"L.","family":"Ma"},{"given":"G.N.","family":"Flerchinger"},{"given":"T.R.","family":"Green"},{"given":"L.R.","family":"Ahuja"}],"container-title":"Agricultural Systems","volume":"89","issued":{"date-parts":[[2006,9]]},"DOI":"10.1016/j.agsy.2005.10.009","URL":"https://doi.org/10.1016/j.agsy.2005.10.009","issue":"2-3","page":"457-477"}}],"schema":"https://github.com/citation-style-language/schema/raw/master/csl-citation.json"} </w:instrText>
+      </w:r>
+      <w:r>
+        <w:fldChar w:fldCharType="separate"/>
+      </w:r>
+      <w:r>
+        <w:t>(Chen et al., 2010; Yu et al., 2006)</w:t>
+      </w:r>
+      <w:r>
+        <w:fldChar w:fldCharType="end"/>
+      </w:r>
+      <w:r>
+        <w:t xml:space="preserve">. Regional crop-water-use evaluation also used CERN monitoring records from Fengqiu, Luancheng and Shangqiu </w:t>
+      </w:r>
+      <w:r>
+        <w:fldChar w:fldCharType="begin"/>
+      </w:r>
+      <w:r>
+        <w:instrText xml:space="preserve"> ADDIN ZOTERO_ITEM CSL_CITATION {"citationID":"7fa2e1b5c2a35020","properties":{"formattedCitation":"(Wang and Shi, 2024)","plainCitation":"(Wang and Shi, 2024)","noteIndex":0},"citationItems":[{"id":"wang2024_crop_water_dataset","itemData":{"id":"wang2024_crop_water_dataset","type":"article-journal","title":"The annual dynamic dataset of high-resolution crop water use in China from 1991 to 2019","author":[{"given":"Minglei","family":"Wang"},{"given":"Wenjiao","family":"Shi"}],"container-title":"Scientific Data","volume":"11","issued":{"date-parts":[[2024,12,18]]},"DOI":"10.1038/s41597-024-04185-0","URL":"https://doi.org/10.1038/s41597-024-04185-0","issue":"1","page":"1373"}}],"schema":"https://github.com/citation-style-language/schema/raw/master/csl-citation.json"} </w:instrText>
+      </w:r>
+      <w:r>
+        <w:fldChar w:fldCharType="separate"/>
+      </w:r>
+      <w:r>
+        <w:t>(Wang and Shi, 2024)</w:t>
+      </w:r>
+      <w:r>
+        <w:fldChar w:fldCharType="end"/>
+      </w:r>
+      <w:r>
+        <w:t>. These publications document earlier use of the station monitoring programs; the exact records, plots and measurement periods retained here are identified by the source datasets and case inventory (Tables S1 and S2).</w:t>
+      </w:r>
+    </w:p>
+    <w:p>
+      <w:pPr>
+        <w:spacing w:line="480" w:lineRule="auto"/>
+      </w:pPr>
+      <w:r>
         <w:t>The station archive preserves 132 crop–plot–season trajectories, whole site-year partitions and source metadata. The 7,397 eligible records occur in 127 cases and retain all five observation sites for their available variables. Calibration and retrospective-evaluation trajectory counts remain 71 and 61. Variable-specific availability and missing combinations are retained in the accompanying case and site tables; missing measurements do not become zero observations.</w:t>
       </w:r>
     </w:p>
@@ -194,7 +318,7 @@
         <w:fldChar w:fldCharType="begin"/>
       </w:r>
       <w:r>
-        <w:instrText xml:space="preserve"> ADDIN ZOTERO_ITEM CSL_CITATION {"citationID":"75e61632e3621274","properties":{"formattedCitation":"(Yang et al., 2024)","plainCitation":"(Yang et al., 2024)","noteIndex":0},"citationItems":[{"id":"yang2024_precipitation","itemData":{"id":"yang2024_precipitation","type":"article-journal","title":"Optimal irrigation for wheat-maize rotation depending on precipitation in the North China Plain: Evidence from a four-year experiment","author":[{"family":"Yang","given":"Lei"},{"family":"Fang","given":"Xiangyang"},{"family":"Zhou","given":"Jie"},{"family":"Zhao","given":"Jie"},{"family":"Hou","given":"Xiqing"},{"family":"Yang","given":"Yadong"},{"family":"Zang","given":"Huadong"},{"family":"Zeng","given":"Zhaohai"}],"issued":{"date-parts":[[2024,4]]},"container-title":"Agricultural Water Management","container-title-short":"Agric. Water Manag.","volume":"294","DOI":"10.1016/j.agwat.2024.108726","URL":"https://doi.org/10.1016/j.agwat.2024.108726","accessed":{"date-parts":[[2026,10,3]]},"language":"en","publisher":"Elsevier BV","page":"108726"}}],"schema":"https://github.com/citation-style-language/schema/raw/master/csl-citation.json"} </w:instrText>
+        <w:instrText xml:space="preserve"> ADDIN ZOTERO_ITEM CSL_CITATION {"citationID":"b5fc7a88cfc077c4","properties":{"formattedCitation":"(Yang et al., 2024)","plainCitation":"(Yang et al., 2024)","noteIndex":0},"citationItems":[{"id":"yang2024_precipitation","itemData":{"id":"yang2024_precipitation","type":"article-journal","title":"Optimal irrigation for wheat-maize rotation depending on precipitation in the North China Plain: Evidence from a four-year experiment","author":[{"family":"Yang","given":"Lei"},{"family":"Fang","given":"Xiangyang"},{"family":"Zhou","given":"Jie"},{"family":"Zhao","given":"Jie"},{"family":"Hou","given":"Xiqing"},{"family":"Yang","given":"Yadong"},{"family":"Zang","given":"Huadong"},{"family":"Zeng","given":"Zhaohai"}],"issued":{"date-parts":[[2024,4]]},"container-title":"Agricultural Water Management","container-title-short":"Agric. Water Manag.","volume":"294","DOI":"10.1016/j.agwat.2024.108726","URL":"https://doi.org/10.1016/j.agwat.2024.108726","accessed":{"date-parts":[[2026,10,3]]},"language":"en","publisher":"Elsevier BV","page":"108726"}}],"schema":"https://github.com/citation-style-language/schema/raw/master/csl-citation.json"} </w:instrText>
       </w:r>
       <w:r>
         <w:fldChar w:fldCharType="separate"/>
@@ -214,7 +338,33 @@
         <w:spacing w:line="480" w:lineRule="auto"/>
       </w:pPr>
       <w:r>
-        <w:t>Twenty-six Fengqiu cases retain antecedent moisture initialization from the preceding calendar month. Complete fifteen-layer 0–1.5 m volumetric profiles map conservatively to the represented model layers, preserving depth-integrated storage. The identical eligibility rule applies to 11 original calibration and 15 evaluation cases. Monthly timing, aggregation and subplot support remain unresolved relative to the exact sowing-day state. Original cases remain available when a measured antecedent profile is absent.</w:t>
+        <w:t xml:space="preserve">Twenty-six Fengqiu cases retain antecedent moisture initialization from the preceding calendar month </w:t>
+      </w:r>
+      <w:r>
+        <w:fldChar w:fldCharType="begin"/>
+      </w:r>
+      <w:r>
+        <w:instrText xml:space="preserve"> ADDIN ZOTERO_ITEM CSL_CITATION {"citationID":"5315b0e6a5cabc6d","properties":{"formattedCitation":"(Fengqiu Station, 2020b)","plainCitation":"(Fengqiu Station, 2020b)","noteIndex":0},"citationItems":[{"id":"fengqiu2020_soil_water","itemData":{"id":"fengqiu2020_soil_water","type":"dataset","title":"Farmland soil-water physical properties at Fengqiu Station, Henan Province, 2005–2008","author":[{"literal":"Fengqiu Station"}],"issued":{"date-parts":[[2020]]},"publisher":"National Ecosystem Science Data Center","version":"v1","DOI":"10.12199/nesdc.ecodb.mon.2020.dp2011.fqa.006","URL":"https://doi.org/10.12199/nesdc.ecodb.mon.2020.dp2011.fqa.006","accessed":{"date-parts":[[2026,10,8]]},"language":"zh","note":"Dataset. Original creator: 河南封丘站. Original title: 2005-2008年河南封丘站农田土壤水分物理性质监测数据. Version v1. English title follows the official Gucheng title or translates the original Chinese station title."}}],"schema":"https://github.com/citation-style-language/schema/raw/master/csl-citation.json"} </w:instrText>
+      </w:r>
+      <w:r>
+        <w:fldChar w:fldCharType="separate"/>
+      </w:r>
+      <w:r>
+        <w:t>(Fengqiu Station, 2020b)</w:t>
+      </w:r>
+      <w:r>
+        <w:fldChar w:fldCharType="end"/>
+      </w:r>
+      <w:r>
+        <w:t>. Volumetric percentages from fifteen 100-mm source layers spanning 0–1.5 m map conservatively to the represented model layers, preserving depth-integrated storage without depth extrapolation or clipping. The identical eligibility rule applies to 11 original calibration and 15 evaluation cases. Monthly timing, aggregation and subplot support remain unresolved relative to the exact sowing-day state. Original cases remain available when a measured antecedent profile is absent.</w:t>
+      </w:r>
+    </w:p>
+    <w:p>
+      <w:pPr>
+        <w:spacing w:line="480" w:lineRule="auto"/>
+      </w:pPr>
+      <w:r>
+        <w:t>Observation eligibility requires valid dates, compatible crop and plot identities, consistent stage sequences and documented quantity units. Measurements and predictions share recorded sampling dates or documented averaging windows. Stage-indexed Gucheng LAI measurements use observed stage dates as sampling coordinates without prescribing simulated development. Fengqiu ET identifies the lysimeter measurement plot, whereas Yucheng ET retains its source measurement definitions. Provider grain and aboveground dry masses in g m⁻² are multiplied by 10 to obtain kg ha⁻¹.</w:t>
       </w:r>
     </w:p>
     <w:p>
@@ -1867,7 +2017,7 @@
         <w:fldChar w:fldCharType="begin"/>
       </w:r>
       <w:r>
-        <w:instrText xml:space="preserve"> ADDIN ZOTERO_ITEM CSL_CITATION {"citationID":"9c3df40893e577b0","properties":{"formattedCitation":"(Meier, 2018)","plainCitation":"(Meier, 2018)","noteIndex":0},"citationItems":[{"id":"meier2018_bbch","itemData":{"id":"meier2018_bbch","type":"book","title":"Growth stages of mono- and dicotyledonous plants: BBCH Monograph","editor":[{"family":"Meier","given":"Uwe"}],"issued":{"date-parts":[[2018]]},"accessed":{"date-parts":[[2026,10,4]]},"publisher":"Julius Kühn-Institut","publisher-place":"Quedlinburg","DOI":"10.5073/20180906-074619","ISBN":"978-3-95547-071-5","URL":"https://www.julius-kuehn.de/media/Veroeffentlichungen/bbch%20epaper%20en/page.pdf","note":"Official English edition; title/editor/year/DOI/ISBN verified on PDF title pages. Cereals p22 visually verifies BBCH83 early dough,85 soft dough,87 hard dough and89 fully ripe. Snapshot JKI_BBCH_English.pdf SHA-256 39d578a19747bfa0a929b1aac7268398e22cdb5e6b2110d61b8fa839145aaee6. The OCM stage-observation mapping and uncertainty range remain application-specific choices."}}],"schema":"https://github.com/citation-style-language/schema/raw/master/csl-citation.json"} </w:instrText>
+        <w:instrText xml:space="preserve"> ADDIN ZOTERO_ITEM CSL_CITATION {"citationID":"ed90e694ca772e90","properties":{"formattedCitation":"(Meier, 2018)","plainCitation":"(Meier, 2018)","noteIndex":0},"citationItems":[{"id":"meier2018_bbch","itemData":{"id":"meier2018_bbch","type":"book","title":"Growth stages of mono- and dicotyledonous plants: BBCH Monograph","editor":[{"family":"Meier","given":"Uwe"}],"issued":{"date-parts":[[2018]]},"accessed":{"date-parts":[[2026,10,4]]},"publisher":"Julius Kühn-Institut","publisher-place":"Quedlinburg","DOI":"10.5073/20180906-074619","ISBN":"978-3-95547-071-5","URL":"https://www.julius-kuehn.de/media/Veroeffentlichungen/bbch%20epaper%20en/page.pdf","note":"Official English edition; title/editor/year/DOI/ISBN verified on PDF title pages. Cereals p22 visually verifies BBCH83 early dough,85 soft dough,87 hard dough and89 fully ripe. Snapshot JKI_BBCH_English.pdf SHA-256 39d578a19747bfa0a929b1aac7268398e22cdb5e6b2110d61b8fa839145aaee6. The OCM stage-observation mapping and uncertainty range remain application-specific choices."}}],"schema":"https://github.com/citation-style-language/schema/raw/master/csl-citation.json"} </w:instrText>
       </w:r>
       <w:r>
         <w:fldChar w:fldCharType="separate"/>
@@ -2557,7 +2707,7 @@
         <w:fldChar w:fldCharType="begin"/>
       </w:r>
       <w:r>
-        <w:instrText xml:space="preserve"> ADDIN ZOTERO_ITEM CSL_CITATION {"citationID":"c9403c106ec1e952","properties":{"formattedCitation":"(Kiniry et al., 1989)","plainCitation":"(Kiniry et al., 1989)","noteIndex":0},"citationItems":[{"id":"kiniry1989_rue","itemData":{"id":"kiniry1989_rue","type":"journal-article","title":"Radiation-use efficiency in biomass accumulation prior to grain-filling for five grain-crop species","author":[{"given":"J.R.","family":"Kiniry"},{"given":"C.A.","family":"Jones"},{"given":"J.C.","family":"O'toole"},{"given":"R.","family":"Blanchet"},{"given":"M.","family":"Cabelguenne"},{"given":"D.A.","family":"Spanel"}],"issued":{"date-parts":[[1989,2]]},"container-title":"Field Crops Research","volume":"20","issue":"1","page":"51-64","DOI":"10.1016/0378-4290(89)90023-3","URL":"http://dx.doi.org/10.1016/0378-4290(89)90023-3","publisher":"Elsevier BV"}}],"schema":"https://github.com/citation-style-language/schema/raw/master/csl-citation.json"} </w:instrText>
+        <w:instrText xml:space="preserve"> ADDIN ZOTERO_ITEM CSL_CITATION {"citationID":"1775dc0b9d655093","properties":{"formattedCitation":"(Kiniry et al., 1989)","plainCitation":"(Kiniry et al., 1989)","noteIndex":0},"citationItems":[{"id":"kiniry1989_rue","itemData":{"id":"kiniry1989_rue","type":"journal-article","title":"Radiation-use efficiency in biomass accumulation prior to grain-filling for five grain-crop species","author":[{"given":"J.R.","family":"Kiniry"},{"given":"C.A.","family":"Jones"},{"given":"J.C.","family":"O'toole"},{"given":"R.","family":"Blanchet"},{"given":"M.","family":"Cabelguenne"},{"given":"D.A.","family":"Spanel"}],"issued":{"date-parts":[[1989,2]]},"container-title":"Field Crops Research","volume":"20","issue":"1","page":"51-64","DOI":"10.1016/0378-4290(89)90023-3","URL":"http://dx.doi.org/10.1016/0378-4290(89)90023-3","publisher":"Elsevier BV"}}],"schema":"https://github.com/citation-style-language/schema/raw/master/csl-citation.json"} </w:instrText>
       </w:r>
       <w:r>
         <w:fldChar w:fldCharType="separate"/>
@@ -2583,7 +2733,7 @@
         <w:fldChar w:fldCharType="begin"/>
       </w:r>
       <w:r>
-        <w:instrText xml:space="preserve"> ADDIN ZOTERO_ITEM CSL_CITATION {"citationID":"f587bdb51ec0d95b","properties":{"formattedCitation":"(de Wit and Berghuijs, n.d.)","plainCitation":"(de Wit and Berghuijs, n.d.)","noteIndex":0},"citationItems":[{"id":"pcse_leaf_dynamics","itemData":{"id":"pcse_leaf_dynamics","type":"software","title":"Python Crop Simulation Environment: WOFOST leaf dynamics implementation","author":[{"family":"de Wit","given":"Allard"},{"family":"Berghuijs","given":"Herman"}],"publisher":"Wageningen Environmental Research","accessed":{"date-parts":[[2026,10,4]]},"version":"Archived master-branch source snapshot","URL":"https://github.com/ajwdewit/pcse/blob/master/pcse/crop/leaf_dynamics.py","note":"Authors and institutional ownership verified from source header. No publication date inferred from copyright dates. Snapshot PCSE_leaf_dynamics.py SHA-256 597c4749c77b5a36c78010eb412f3c958f3059eea09df9e5e6b06e5bf9813244. Each new leaf class retains its birth SLA; physiological age depends on temperature."}}],"schema":"https://github.com/citation-style-language/schema/raw/master/csl-citation.json"} </w:instrText>
+        <w:instrText xml:space="preserve"> ADDIN ZOTERO_ITEM CSL_CITATION {"citationID":"315a09d9bc39bce4","properties":{"formattedCitation":"(de Wit and Berghuijs, n.d.)","plainCitation":"(de Wit and Berghuijs, n.d.)","noteIndex":0},"citationItems":[{"id":"pcse_leaf_dynamics","itemData":{"id":"pcse_leaf_dynamics","type":"software","title":"Python Crop Simulation Environment: WOFOST leaf dynamics implementation","author":[{"family":"de Wit","given":"Allard"},{"family":"Berghuijs","given":"Herman"}],"publisher":"Wageningen Environmental Research","accessed":{"date-parts":[[2026,10,4]]},"version":"Archived master-branch source snapshot","URL":"https://github.com/ajwdewit/pcse/blob/master/pcse/crop/leaf_dynamics.py","note":"Authors and institutional ownership verified from source header. No publication date inferred from copyright dates. Snapshot PCSE_leaf_dynamics.py SHA-256 597c4749c77b5a36c78010eb412f3c958f3059eea09df9e5e6b06e5bf9813244. Each new leaf class retains its birth SLA; physiological age depends on temperature."}}],"schema":"https://github.com/citation-style-language/schema/raw/master/csl-citation.json"} </w:instrText>
       </w:r>
       <w:r>
         <w:fldChar w:fldCharType="separate"/>
@@ -2674,7 +2824,7 @@
         <w:fldChar w:fldCharType="begin"/>
       </w:r>
       <w:r>
-        <w:instrText xml:space="preserve"> ADDIN ZOTERO_ITEM CSL_CITATION {"citationID":"5c2ecbe8f9d9f154","properties":{"formattedCitation":"(Tan et al., 2020)","plainCitation":"(Tan et al., 2020)","noteIndex":0},"citationItems":[{"id":"tan2020_stage_senescence","itemData":{"id":"tan2020_stage_senescence","type":"article-journal","title":"Dynamic process-based modelling of crop growth and competitive water extraction in relay strip intercropping: Model development and application to wheat-maize intercropping","author":[{"family":"Tan","given":"Meixiu"},{"family":"Gou","given":"Fang"},{"family":"Stomph","given":"Tjeerd Jan"},{"family":"Wang","given":"Jing"},{"family":"Yin","given":"Wen"},{"family":"Zhang","given":"Lizhen"},{"family":"Chai","given":"Qiang"},{"family":"van der Werf","given":"Wopke"}],"container-title":"Field Crops Research","volume":"246","article-number":"107613","issued":{"date-parts":[[2020,2]]},"DOI":"10.1016/j.fcr.2019.107613","URL":"https://doi.org/10.1016/j.fcr.2019.107613","note":"Publisher DOI metadata and author-institution full text verified 2026-10-04; stage-dependent thermal leaf-death rates support the process form, not independently measured site-specific trait values.","page":"107613"}}],"schema":"https://github.com/citation-style-language/schema/raw/master/csl-citation.json"} </w:instrText>
+        <w:instrText xml:space="preserve"> ADDIN ZOTERO_ITEM CSL_CITATION {"citationID":"caa0a9337c6d48b2","properties":{"formattedCitation":"(Tan et al., 2020)","plainCitation":"(Tan et al., 2020)","noteIndex":0},"citationItems":[{"id":"tan2020_stage_senescence","itemData":{"id":"tan2020_stage_senescence","type":"article-journal","title":"Dynamic process-based modelling of crop growth and competitive water extraction in relay strip intercropping: Model development and application to wheat-maize intercropping","author":[{"family":"Tan","given":"Meixiu"},{"family":"Gou","given":"Fang"},{"family":"Stomph","given":"Tjeerd Jan"},{"family":"Wang","given":"Jing"},{"family":"Yin","given":"Wen"},{"family":"Zhang","given":"Lizhen"},{"family":"Chai","given":"Qiang"},{"family":"van der Werf","given":"Wopke"}],"container-title":"Field Crops Research","volume":"246","article-number":"107613","issued":{"date-parts":[[2020,2]]},"DOI":"10.1016/j.fcr.2019.107613","URL":"https://doi.org/10.1016/j.fcr.2019.107613","note":"Publisher DOI metadata and author-institution full text verified 2026-10-04; stage-dependent thermal leaf-death rates support the process form, not independently measured site-specific trait values.","page":"107613"}}],"schema":"https://github.com/citation-style-language/schema/raw/master/csl-citation.json"} </w:instrText>
       </w:r>
       <w:r>
         <w:fldChar w:fldCharType="separate"/>
@@ -3210,7 +3360,7 @@
         <w:fldChar w:fldCharType="begin"/>
       </w:r>
       <w:r>
-        <w:instrText xml:space="preserve"> ADDIN ZOTERO_ITEM CSL_CITATION {"citationID":"801a351470a74f06","properties":{"formattedCitation":"(APSIM Initiative, 2026; de Wit, 2022; de Wit, 2020)","plainCitation":"(APSIM Initiative, 2026; de Wit, 2022; de Wit, 2020)","noteIndex":0},"citationItems":[{"id":"wofost_wheat_parameters","itemData":{"id":"wofost_wheat_parameters","type":"dataset","title":"Parameter sets for the WOFOST 7.2/7.3 cropping system model for wheat","author":[{"family":"de Wit","given":"Allard"}],"publisher":"Wageningen Environmental Research","issued":{"date-parts":[[2020,1,1]]},"accessed":{"date-parts":[[2026,10,4]]},"version":"1.0.0; wofost72 branch, SHA-256 archived snapshot","URL":"https://github.com/ajwdewit/WOFOST_crop_parameters/blob/wofost72/wheat.yaml","note":"Creator, publisher, title, version and date verified from the archived YAML Metadata block. Snapshot WOFOST72_wheat.yaml SHA-256 03b47ab0f4399551a1475f87090da7bae553caab47aa1a20010b7238c1cd8d87. Supports model-specific SLATB scale and development-stage tabulation; it does not establish universal physiological bounds."}},{"id":"wofost_maize_parameters","itemData":{"id":"wofost_maize_parameters","type":"dataset","title":"Parameter sets for the WOFOST 7.2/7.3 model for simulating maize","author":[{"family":"de Wit","given":"Allard"}],"publisher":"Wageningen Environmental Research","issued":{"date-parts":[[2022,2,13]]},"accessed":{"date-parts":[[2026,10,4]]},"version":"1.0.0; wofost72 branch, SHA-256 archived snapshot","URL":"https://github.com/ajwdewit/WOFOST_crop_parameters/blob/wofost72/maize.yaml","note":"Creator, publisher, title, version and date verified from the archived YAML Metadata block. Snapshot WOFOST72_maize.yaml SHA-256 bcc63309c8c96137fe3f5463585463387169f3c15a4a8d102a43820b695d88d9. Temperate-maize SLATB changes from 0.026 to 0.012 m2/g; tropical-maize values change from 0.035 to 0.016. These parameterizations inform conditional regularization, not universal limits."}},{"id":"apsim_ng_source_2026","itemData":{"id":"apsim_ng_source_2026","type":"software","title":"APSIM Next Generation (ApsimX): wheat and maize model definitions","author":[{"literal":"APSIM Initiative"}],"issued":{"date-parts":[[2026,10,1]]},"version":"074d15f51889a386d3667acfed184d03e4e8f65f","publisher":"APSIM Initiative","URL":"https://github.com/APSIMInitiative/ApsimX/tree/074d15f51889a386d3667acfed184d03e4e8f65f/Models/Resources","accessed":{"date-parts":[[2026,10,4]]},"note":"Version date is the upstream commit date, not the original date of trait estimation. Models/Resources/Wheat.json and Maize.json are byte-identical to the frozen parameter sources. Wheat SHA-256: c3dab36b40dcd205d04e4b7494f8faa3a71bd3c596cd7c40f5a9e86ed0b353aa; maize SHA-256: caa9c213c23d7843c4648d2b486412210d29e1c86b9d6f13ba083b26ca0c7e9a. Trait values are conditional model priors, rather than regional observations."}}],"schema":"https://github.com/citation-style-language/schema/raw/master/csl-citation.json"} </w:instrText>
+        <w:instrText xml:space="preserve"> ADDIN ZOTERO_ITEM CSL_CITATION {"citationID":"0be8241364265290","properties":{"formattedCitation":"(APSIM Initiative, 2026; de Wit, 2022; de Wit, 2020)","plainCitation":"(APSIM Initiative, 2026; de Wit, 2022; de Wit, 2020)","noteIndex":0},"citationItems":[{"id":"wofost_wheat_parameters","itemData":{"id":"wofost_wheat_parameters","type":"dataset","title":"Parameter sets for the WOFOST 7.2/7.3 cropping system model for wheat","author":[{"family":"de Wit","given":"Allard"}],"publisher":"Wageningen Environmental Research","issued":{"date-parts":[[2020,1,1]]},"accessed":{"date-parts":[[2026,10,4]]},"version":"1.0.0; wofost72 branch, SHA-256 archived snapshot","URL":"https://github.com/ajwdewit/WOFOST_crop_parameters/blob/wofost72/wheat.yaml","note":"Creator, publisher, title, version and date verified from the archived YAML Metadata block. Snapshot WOFOST72_wheat.yaml SHA-256 03b47ab0f4399551a1475f87090da7bae553caab47aa1a20010b7238c1cd8d87. Supports model-specific SLATB scale and development-stage tabulation; it does not establish universal physiological bounds."}},{"id":"wofost_maize_parameters","itemData":{"id":"wofost_maize_parameters","type":"dataset","title":"Parameter sets for the WOFOST 7.2/7.3 model for simulating maize","author":[{"family":"de Wit","given":"Allard"}],"publisher":"Wageningen Environmental Research","issued":{"date-parts":[[2022,2,13]]},"accessed":{"date-parts":[[2026,10,4]]},"version":"1.0.0; wofost72 branch, SHA-256 archived snapshot","URL":"https://github.com/ajwdewit/WOFOST_crop_parameters/blob/wofost72/maize.yaml","note":"Creator, publisher, title, version and date verified from the archived YAML Metadata block. Snapshot WOFOST72_maize.yaml SHA-256 bcc63309c8c96137fe3f5463585463387169f3c15a4a8d102a43820b695d88d9. Temperate-maize SLATB changes from 0.026 to 0.012 m2/g; tropical-maize values change from 0.035 to 0.016. These parameterizations inform conditional regularization, not universal limits."}},{"id":"apsim_ng_source_2026","itemData":{"id":"apsim_ng_source_2026","type":"software","title":"APSIM Next Generation (ApsimX): wheat and maize model definitions","author":[{"literal":"APSIM Initiative"}],"issued":{"date-parts":[[2026,10,1]]},"version":"074d15f51889a386d3667acfed184d03e4e8f65f","publisher":"APSIM Initiative","URL":"https://github.com/APSIMInitiative/ApsimX/tree/074d15f51889a386d3667acfed184d03e4e8f65f/Models/Resources","accessed":{"date-parts":[[2026,10,4]]},"note":"Version date is the upstream commit date, not the original date of trait estimation. Models/Resources/Wheat.json and Maize.json are byte-identical to the frozen parameter sources. Wheat SHA-256: c3dab36b40dcd205d04e4b7494f8faa3a71bd3c596cd7c40f5a9e86ed0b353aa; maize SHA-256: caa9c213c23d7843c4648d2b486412210d29e1c86b9d6f13ba083b26ca0c7e9a. Trait values are conditional model priors, rather than regional observations."}}],"schema":"https://github.com/citation-style-language/schema/raw/master/csl-citation.json"} </w:instrText>
       </w:r>
       <w:r>
         <w:fldChar w:fldCharType="separate"/>
@@ -4085,7 +4235,7 @@
         <w:fldChar w:fldCharType="begin"/>
       </w:r>
       <w:r>
-        <w:instrText xml:space="preserve"> ADDIN ZOTERO_ITEM CSL_CITATION {"citationID":"9aeaf24a0ecf2d61","properties":{"formattedCitation":"(Allen et al., 1998)","plainCitation":"(Allen et al., 1998)","noteIndex":0},"citationItems":[{"id":"allen1998_fao56","itemData":{"id":"allen1998_fao56","type":"book","title":"Crop evapotranspiration: Guidelines for computing crop water requirements","author":[{"family":"Allen","given":"Richard G."},{"family":"Pereira","given":"Luis S."},{"family":"Raes","given":"Dirk"},{"family":"Smith","given":"Martin"}],"issued":{"date-parts":[[1998]]},"publisher":"Food and Agriculture Organization of the United Nations","publisher-place":"Rome","collection-title":"FAO Irrigation and Drainage Paper","number":"56","ISBN":"92-5-104219-5","URL":"https://www.fao.org/4/x0490e/x0490e00.htm","accessed":{"date-parts":[[2026,10,4]]}}}],"schema":"https://github.com/citation-style-language/schema/raw/master/csl-citation.json"} </w:instrText>
+        <w:instrText xml:space="preserve"> ADDIN ZOTERO_ITEM CSL_CITATION {"citationID":"bea0ae167ce88e54","properties":{"formattedCitation":"(Allen et al., 1998)","plainCitation":"(Allen et al., 1998)","noteIndex":0},"citationItems":[{"id":"allen1998_fao56","itemData":{"id":"allen1998_fao56","type":"book","title":"Crop evapotranspiration: Guidelines for computing crop water requirements","author":[{"family":"Allen","given":"Richard G."},{"family":"Pereira","given":"Luis S."},{"family":"Raes","given":"Dirk"},{"family":"Smith","given":"Martin"}],"issued":{"date-parts":[[1998]]},"publisher":"Food and Agriculture Organization of the United Nations","publisher-place":"Rome","collection-title":"FAO Irrigation and Drainage Paper","number":"56","ISBN":"92-5-104219-5","URL":"https://www.fao.org/4/x0490e/x0490e00.htm","accessed":{"date-parts":[[2026,10,4]]}}}],"schema":"https://github.com/citation-style-language/schema/raw/master/csl-citation.json"} </w:instrText>
       </w:r>
       <w:r>
         <w:fldChar w:fldCharType="separate"/>
@@ -4895,7 +5045,7 @@
         <w:fldChar w:fldCharType="begin"/>
       </w:r>
       <w:r>
-        <w:instrText xml:space="preserve"> ADDIN ZOTERO_ITEM CSL_CITATION {"citationID":"ee2f1b2a89420012","properties":{"formattedCitation":"(Allen et al., 1998)","plainCitation":"(Allen et al., 1998)","noteIndex":0},"citationItems":[{"id":"allen1998_fao56","itemData":{"id":"allen1998_fao56","type":"book","title":"Crop evapotranspiration: Guidelines for computing crop water requirements","author":[{"family":"Allen","given":"Richard G."},{"family":"Pereira","given":"Luis S."},{"family":"Raes","given":"Dirk"},{"family":"Smith","given":"Martin"}],"issued":{"date-parts":[[1998]]},"publisher":"Food and Agriculture Organization of the United Nations","publisher-place":"Rome","collection-title":"FAO Irrigation and Drainage Paper","number":"56","ISBN":"92-5-104219-5","URL":"https://www.fao.org/4/x0490e/x0490e00.htm","accessed":{"date-parts":[[2026,10,4]]}}}],"schema":"https://github.com/citation-style-language/schema/raw/master/csl-citation.json"} </w:instrText>
+        <w:instrText xml:space="preserve"> ADDIN ZOTERO_ITEM CSL_CITATION {"citationID":"e2e0ca1348fae17e","properties":{"formattedCitation":"(Allen et al., 1998)","plainCitation":"(Allen et al., 1998)","noteIndex":0},"citationItems":[{"id":"allen1998_fao56","itemData":{"id":"allen1998_fao56","type":"book","title":"Crop evapotranspiration: Guidelines for computing crop water requirements","author":[{"family":"Allen","given":"Richard G."},{"family":"Pereira","given":"Luis S."},{"family":"Raes","given":"Dirk"},{"family":"Smith","given":"Martin"}],"issued":{"date-parts":[[1998]]},"publisher":"Food and Agriculture Organization of the United Nations","publisher-place":"Rome","collection-title":"FAO Irrigation and Drainage Paper","number":"56","ISBN":"92-5-104219-5","URL":"https://www.fao.org/4/x0490e/x0490e00.htm","accessed":{"date-parts":[[2026,10,4]]}}}],"schema":"https://github.com/citation-style-language/schema/raw/master/csl-citation.json"} </w:instrText>
       </w:r>
       <w:r>
         <w:fldChar w:fldCharType="separate"/>
@@ -5965,7 +6115,7 @@
         <w:fldChar w:fldCharType="begin"/>
       </w:r>
       <w:r>
-        <w:instrText xml:space="preserve"> ADDIN ZOTERO_ITEM CSL_CITATION {"citationID":"0eeaf614ecd0c0e8","properties":{"formattedCitation":"(van Genuchten, 1980)","plainCitation":"(van Genuchten, 1980)","noteIndex":0},"citationItems":[{"id":"vangenuchten1980","itemData":{"id":"vangenuchten1980","type":"article-journal","title":"A Closed‐form Equation for Predicting the Hydraulic Conductivity of Unsaturated Soils","author":[{"given":"M. Th.","family":"van Genuchten"}],"issued":{"date-parts":[[1980,9]]},"container-title":"Soil Science Society of America Journal","volume":"44","issue":"5","page":"892-898","DOI":"10.2136/sssaj1980.03615995004400050002x","URL":"https://doi.org/10.2136/sssaj1980.03615995004400050002x"}}],"schema":"https://github.com/citation-style-language/schema/raw/master/csl-citation.json"} </w:instrText>
+        <w:instrText xml:space="preserve"> ADDIN ZOTERO_ITEM CSL_CITATION {"citationID":"4dc9b95e52b799bb","properties":{"formattedCitation":"(van Genuchten, 1980)","plainCitation":"(van Genuchten, 1980)","noteIndex":0},"citationItems":[{"id":"vangenuchten1980","itemData":{"id":"vangenuchten1980","type":"article-journal","title":"A Closed‐form Equation for Predicting the Hydraulic Conductivity of Unsaturated Soils","author":[{"given":"M. Th.","family":"van Genuchten"}],"issued":{"date-parts":[[1980,9]]},"container-title":"Soil Science Society of America Journal","volume":"44","issue":"5","page":"892-898","DOI":"10.2136/sssaj1980.03615995004400050002x","URL":"https://doi.org/10.2136/sssaj1980.03615995004400050002x"}}],"schema":"https://github.com/citation-style-language/schema/raw/master/csl-citation.json"} </w:instrText>
       </w:r>
       <w:r>
         <w:fldChar w:fldCharType="separate"/>
@@ -6294,7 +6444,7 @@
         <w:fldChar w:fldCharType="begin"/>
       </w:r>
       <w:r>
-        <w:instrText xml:space="preserve"> ADDIN ZOTERO_ITEM CSL_CITATION {"citationID":"d0a50fca5ec29a08","properties":{"formattedCitation":"(Mualem, 1976; van Genuchten, 1980)","plainCitation":"(Mualem, 1976; van Genuchten, 1980)","noteIndex":0},"citationItems":[{"id":"mualem1976","itemData":{"id":"mualem1976","type":"article-journal","title":"A new model for predicting the hydraulic conductivity of unsaturated porous media","author":[{"given":"Yechezkel","family":"Mualem"}],"issued":{"date-parts":[[1976,6]]},"container-title":"Water Resources Research","volume":"12","issue":"3","page":"513-522","DOI":"10.1029/wr012i003p00513","URL":"https://doi.org/10.1029/wr012i003p00513"}},{"id":"vangenuchten1980","itemData":{"id":"vangenuchten1980","type":"article-journal","title":"A Closed‐form Equation for Predicting the Hydraulic Conductivity of Unsaturated Soils","author":[{"given":"M. Th.","family":"van Genuchten"}],"issued":{"date-parts":[[1980,9]]},"container-title":"Soil Science Society of America Journal","volume":"44","issue":"5","page":"892-898","DOI":"10.2136/sssaj1980.03615995004400050002x","URL":"https://doi.org/10.2136/sssaj1980.03615995004400050002x"}}],"schema":"https://github.com/citation-style-language/schema/raw/master/csl-citation.json"} </w:instrText>
+        <w:instrText xml:space="preserve"> ADDIN ZOTERO_ITEM CSL_CITATION {"citationID":"52d6b4195c022a0b","properties":{"formattedCitation":"(Mualem, 1976; van Genuchten, 1980)","plainCitation":"(Mualem, 1976; van Genuchten, 1980)","noteIndex":0},"citationItems":[{"id":"mualem1976","itemData":{"id":"mualem1976","type":"article-journal","title":"A new model for predicting the hydraulic conductivity of unsaturated porous media","author":[{"given":"Yechezkel","family":"Mualem"}],"issued":{"date-parts":[[1976,6]]},"container-title":"Water Resources Research","volume":"12","issue":"3","page":"513-522","DOI":"10.1029/wr012i003p00513","URL":"https://doi.org/10.1029/wr012i003p00513"}},{"id":"vangenuchten1980","itemData":{"id":"vangenuchten1980","type":"article-journal","title":"A Closed‐form Equation for Predicting the Hydraulic Conductivity of Unsaturated Soils","author":[{"given":"M. Th.","family":"van Genuchten"}],"issued":{"date-parts":[[1980,9]]},"container-title":"Soil Science Society of America Journal","volume":"44","issue":"5","page":"892-898","DOI":"10.2136/sssaj1980.03615995004400050002x","URL":"https://doi.org/10.2136/sssaj1980.03615995004400050002x"}}],"schema":"https://github.com/citation-style-language/schema/raw/master/csl-citation.json"} </w:instrText>
       </w:r>
       <w:r>
         <w:fldChar w:fldCharType="separate"/>
@@ -8165,7 +8315,7 @@
         <w:fldChar w:fldCharType="begin"/>
       </w:r>
       <w:r>
-        <w:instrText xml:space="preserve"> ADDIN ZOTERO_ITEM CSL_CITATION {"citationID":"84199689fcb4e454","properties":{"formattedCitation":"(Wu et al., 2023)","plainCitation":"(Wu et al., 2023)","noteIndex":0},"citationItems":[{"id":"wu2023_vadose_zone","itemData":{"id":"wu2023_vadose_zone","type":"article-journal","title":"Monitoring of Thick Vadose Zone Water Dynamics Under Irrigation Using a 48 m Deep Caisson at the Luancheng Critical Zone Observatory","author":[{"family":"Wu","given":"Lin"},{"family":"Min","given":"Leilei"},{"family":"Liu","given":"Meiying"},{"family":"Zhang","given":"Yucui"},{"family":"Pei","given":"Hongwei"},{"family":"Li","given":"Hongjun"},{"family":"Zhang","given":"Guanglu"},{"family":"Wang","given":"Shiqin"},{"family":"Shen","given":"Yanjun"}],"issued":{"date-parts":[[2023,5]]},"container-title":"Water Resources Research","container-title-short":"Water Resour. Res.","volume":"59","DOI":"10.1029/2022wr032965","URL":"https://doi.org/10.1029/2022wr032965","accessed":{"date-parts":[[2026,10,3]]},"language":"en","publisher":"American Geophysical Union (AGU)","issue":"5","page":"e2022WR032965"}}],"schema":"https://github.com/citation-style-language/schema/raw/master/csl-citation.json"} </w:instrText>
+        <w:instrText xml:space="preserve"> ADDIN ZOTERO_ITEM CSL_CITATION {"citationID":"f69cd1b280c45d33","properties":{"formattedCitation":"(Wu et al., 2023)","plainCitation":"(Wu et al., 2023)","noteIndex":0},"citationItems":[{"id":"wu2023_vadose_zone","itemData":{"id":"wu2023_vadose_zone","type":"article-journal","title":"Monitoring of Thick Vadose Zone Water Dynamics Under Irrigation Using a 48 m Deep Caisson at the Luancheng Critical Zone Observatory","author":[{"family":"Wu","given":"Lin"},{"family":"Min","given":"Leilei"},{"family":"Liu","given":"Meiying"},{"family":"Zhang","given":"Yucui"},{"family":"Pei","given":"Hongwei"},{"family":"Li","given":"Hongjun"},{"family":"Zhang","given":"Guanglu"},{"family":"Wang","given":"Shiqin"},{"family":"Shen","given":"Yanjun"}],"issued":{"date-parts":[[2023,5]]},"container-title":"Water Resources Research","container-title-short":"Water Resour. Res.","volume":"59","DOI":"10.1029/2022wr032965","URL":"https://doi.org/10.1029/2022wr032965","accessed":{"date-parts":[[2026,10,3]]},"language":"en","publisher":"American Geophysical Union (AGU)","issue":"5","page":"e2022WR032965"}}],"schema":"https://github.com/citation-style-language/schema/raw/master/csl-citation.json"} </w:instrText>
       </w:r>
       <w:r>
         <w:fldChar w:fldCharType="separate"/>
@@ -8200,7 +8350,7 @@
         <w:fldChar w:fldCharType="begin"/>
       </w:r>
       <w:r>
-        <w:instrText xml:space="preserve"> ADDIN ZOTERO_ITEM CSL_CITATION {"citationID":"65bca87b1107d3fb","properties":{"formattedCitation":"(Saxton and Rawls, 2006)","plainCitation":"(Saxton and Rawls, 2006)","noteIndex":0},"citationItems":[{"id":"saxton2006_hydraulics","itemData":{"id":"saxton2006_hydraulics","type":"article-journal","title":"Soil Water Characteristic Estimates by Texture and Organic Matter for Hydrologic Solutions","author":[{"family":"Saxton","given":"K. E."},{"family":"Rawls","given":"W. J."}],"container-title":"Soil Science Society of America Journal","volume":"70","issue":"5","page":"1569-1578","issued":{"date-parts":[[2006,9,1]]},"accessed":{"date-parts":[[2026,10,3]]},"DOI":"10.2136/sssaj2005.0117","URL":"https://acsess.onlinelibrary.wiley.com/doi/10.2136/sssaj2005.0117","note":"Publisher title/authors/date/volume/issue/pages and Crossref DOI metadata verified 2026-10-03. Publisher publication date2006-09-01; Crossref records2006-09. Source supports texture/organic-matter pedotransfer estimates, not verified site-specific hydraulic measurements."}}],"schema":"https://github.com/citation-style-language/schema/raw/master/csl-citation.json"} </w:instrText>
+        <w:instrText xml:space="preserve"> ADDIN ZOTERO_ITEM CSL_CITATION {"citationID":"38537cb21237502d","properties":{"formattedCitation":"(Saxton and Rawls, 2006)","plainCitation":"(Saxton and Rawls, 2006)","noteIndex":0},"citationItems":[{"id":"saxton2006_hydraulics","itemData":{"id":"saxton2006_hydraulics","type":"article-journal","title":"Soil Water Characteristic Estimates by Texture and Organic Matter for Hydrologic Solutions","author":[{"family":"Saxton","given":"K. E."},{"family":"Rawls","given":"W. J."}],"container-title":"Soil Science Society of America Journal","volume":"70","issue":"5","page":"1569-1578","issued":{"date-parts":[[2006,9,1]]},"accessed":{"date-parts":[[2026,10,3]]},"DOI":"10.2136/sssaj2005.0117","URL":"https://acsess.onlinelibrary.wiley.com/doi/10.2136/sssaj2005.0117","note":"Publisher title/authors/date/volume/issue/pages and Crossref DOI metadata verified 2026-10-03. Publisher publication date2006-09-01; Crossref records2006-09. Source supports texture/organic-matter pedotransfer estimates, not verified site-specific hydraulic measurements."}}],"schema":"https://github.com/citation-style-language/schema/raw/master/csl-citation.json"} </w:instrText>
       </w:r>
       <w:r>
         <w:fldChar w:fldCharType="separate"/>
@@ -8305,7 +8455,7 @@
         <w:fldChar w:fldCharType="begin"/>
       </w:r>
       <w:r>
-        <w:instrText xml:space="preserve"> ADDIN ZOTERO_ITEM CSL_CITATION {"citationID":"90f58b664885a93f","properties":{"formattedCitation":"(ISRIC — World Soil Information, 2020)","plainCitation":"(ISRIC — World Soil Information, 2020)","noteIndex":0},"citationItems":[{"id":"soilgrids2020_dataset","itemData":{"id":"soilgrids2020_dataset","type":"dataset","title":"SoilGrids250m version 2.0","author":[{"literal":"ISRIC — World Soil Information"}],"issued":{"date-parts":[[2020]]},"URL":"https://docs.isric.org/globaldata/soilgrids/SoilGrids_faqs.html"}}],"schema":"https://github.com/citation-style-language/schema/raw/master/csl-citation.json"} </w:instrText>
+        <w:instrText xml:space="preserve"> ADDIN ZOTERO_ITEM CSL_CITATION {"citationID":"84403c7ea8168d07","properties":{"formattedCitation":"(ISRIC — World Soil Information, 2020)","plainCitation":"(ISRIC — World Soil Information, 2020)","noteIndex":0},"citationItems":[{"id":"soilgrids2020_dataset","itemData":{"id":"soilgrids2020_dataset","type":"dataset","title":"SoilGrids250m version 2.0","author":[{"literal":"ISRIC — World Soil Information"}],"issued":{"date-parts":[[2020]]},"URL":"https://docs.isric.org/globaldata/soilgrids/SoilGrids_faqs.html"}}],"schema":"https://github.com/citation-style-language/schema/raw/master/csl-citation.json"} </w:instrText>
       </w:r>
       <w:r>
         <w:fldChar w:fldCharType="separate"/>
@@ -10378,7 +10528,7 @@
         <w:fldChar w:fldCharType="begin"/>
       </w:r>
       <w:r>
-        <w:instrText xml:space="preserve"> ADDIN ZOTERO_ITEM CSL_CITATION {"citationID":"5b2d8856ddec92dc","properties":{"formattedCitation":"(NASA JPL, 2013)","plainCitation":"(NASA JPL, 2013)","noteIndex":0},"citationItems":[{"id":"srtm","itemData":{"id":"srtm","type":"dataset","title":"NASA Shuttle Radar Topography Mission Global 1 arc second","author":[{"literal":"NASA JPL"}],"issued":{"date-parts":[[2013]]},"DOI":"10.5067/MEASURES/SRTM/SRTMGL1.003","URL":"https://www.earthdata.nasa.gov/data/catalog/lpcloud-srtmgl1-003","publisher":"NASA Land Processes Distributed Active Archive Center"}}],"schema":"https://github.com/citation-style-language/schema/raw/master/csl-citation.json"} </w:instrText>
+        <w:instrText xml:space="preserve"> ADDIN ZOTERO_ITEM CSL_CITATION {"citationID":"6b122adc1c8821e7","properties":{"formattedCitation":"(NASA JPL, 2013)","plainCitation":"(NASA JPL, 2013)","noteIndex":0},"citationItems":[{"id":"srtm","itemData":{"id":"srtm","type":"dataset","title":"NASA Shuttle Radar Topography Mission Global 1 arc second","author":[{"literal":"NASA JPL"}],"issued":{"date-parts":[[2013]]},"DOI":"10.5067/MEASURES/SRTM/SRTMGL1.003","URL":"https://www.earthdata.nasa.gov/data/catalog/lpcloud-srtmgl1-003","publisher":"NASA Land Processes Distributed Active Archive Center"}}],"schema":"https://github.com/citation-style-language/schema/raw/master/csl-citation.json"} </w:instrText>
       </w:r>
       <w:r>
         <w:fldChar w:fldCharType="separate"/>
@@ -10404,7 +10554,7 @@
         <w:fldChar w:fldCharType="begin"/>
       </w:r>
       <w:r>
-        <w:instrText xml:space="preserve"> ADDIN ZOTERO_ITEM CSL_CITATION {"citationID":"33fb0d79498c7d82","properties":{"formattedCitation":"(Qiu et al., 2022)","plainCitation":"(Qiu et al., 2022)","noteIndex":0},"citationItems":[{"id":"chinacp2022","itemData":{"id":"chinacp2022","type":"journal-article","title":"Maps of cropping patterns in China during 2015–2021","author":[{"given":"Bingwen","family":"Qiu"},{"given":"Xiang","family":"Hu"},{"given":"Chongcheng","family":"Chen"},{"given":"Zhenghong","family":"Tang"},{"given":"Peng","family":"Yang"},{"given":"Xiaolin","family":"Zhu"},{"given":"Chao","family":"Yan"},{"given":"Zeyu","family":"Jian"}],"issued":{"date-parts":[[2022,8,5]]},"container-title":"Scientific Data","volume":"9","issue":"1","article-number":"479","DOI":"10.1038/s41597-022-01589-8","URL":"http://dx.doi.org/10.1038/s41597-022-01589-8","publisher":"Springer Science and Business Media LLC","page":"479"}}],"schema":"https://github.com/citation-style-language/schema/raw/master/csl-citation.json"} </w:instrText>
+        <w:instrText xml:space="preserve"> ADDIN ZOTERO_ITEM CSL_CITATION {"citationID":"12089299352a0148","properties":{"formattedCitation":"(Qiu et al., 2022)","plainCitation":"(Qiu et al., 2022)","noteIndex":0},"citationItems":[{"id":"chinacp2022","itemData":{"id":"chinacp2022","type":"journal-article","title":"Maps of cropping patterns in China during 2015–2021","author":[{"given":"Bingwen","family":"Qiu"},{"given":"Xiang","family":"Hu"},{"given":"Chongcheng","family":"Chen"},{"given":"Zhenghong","family":"Tang"},{"given":"Peng","family":"Yang"},{"given":"Xiaolin","family":"Zhu"},{"given":"Chao","family":"Yan"},{"given":"Zeyu","family":"Jian"}],"issued":{"date-parts":[[2022,8,5]]},"container-title":"Scientific Data","volume":"9","issue":"1","article-number":"479","DOI":"10.1038/s41597-022-01589-8","URL":"http://dx.doi.org/10.1038/s41597-022-01589-8","publisher":"Springer Science and Business Media LLC","page":"479"}}],"schema":"https://github.com/citation-style-language/schema/raw/master/csl-citation.json"} </w:instrText>
       </w:r>
       <w:r>
         <w:fldChar w:fldCharType="separate"/>
@@ -10422,7 +10572,7 @@
         <w:fldChar w:fldCharType="begin"/>
       </w:r>
       <w:r>
-        <w:instrText xml:space="preserve"> ADDIN ZOTERO_ITEM CSL_CITATION {"citationID":"1eb6224f3e122e7c","properties":{"formattedCitation":"(Fu et al., 2026; Fu et al., 2025)","plainCitation":"(Fu et al., 2026; Fu et al., 2025)","noteIndex":0},"citationItems":[{"id":"fu2025_ccd_dataset","itemData":{"id":"fu2025_ccd_dataset","type":"dataset","title":"China Crop Dataset: A long-term and high-resolution crop distribution dataset in China","author":[{"given":"Yangyang","family":"Fu"},{"given":"Jie","family":"Dong"},{"given":"Ruoque","family":"Shen"},{"given":"Qiongyan","family":"Peng"},{"given":"Xiangqian","family":"Li"},{"given":"Yi","family":"Zheng"},{"given":"Baihong","family":"Pan"},{"given":"Jinwei","family":"Dong"},{"given":"Bingwen","family":"Qiu"},{"given":"Jianxi","family":"Huang"},{"given":"Wenping","family":"Yuan"}],"issued":{"date-parts":[[2025,11,28]]},"accessed":{"date-parts":[[2026,10,4]]},"publisher":"Science Data Bank","version":"1.0.0 (repository citationV1)","DOI":"10.57760/sciencedb.32361","URL":"https://doi.org/10.57760/sciencedb.32361","note":"Datasetidentityverifiedfromexistingofficialrepositorymetadata.30mChinaCropDataset2001–2024;class9=winterwheat–maizerotation. The2020layerincomparisonispartofthisdataset,notCCD-Maize-only. Snapshot CCD_repository_metadata.json SHA-256 205dbd2ca8692b8ff4605df6ae110d71b0ff5a2a6aef9bb3052bcb3e8c34912e."}},{"id":"fu2026_ccd_descriptor","itemData":{"id":"fu2026_ccd_descriptor","type":"article-journal","title":"A 30-m annual distribution dataset of major crops in China from 2001-2024","author":[{"family":"Fu","given":"Yangyang"},{"family":"Dong","given":"Jie"},{"family":"Shen","given":"Ruoque"},{"family":"Peng","given":"Qiongyan"},{"family":"Li","given":"Xiangqian"},{"family":"Zheng","given":"Yi"},{"family":"Pan","given":"Baihong"},{"family":"Dong","given":"Jinwei"},{"family":"Qiu","given":"Bingwen"},{"family":"Huang","given":"Jianxi"},{"family":"Huang","given":"Xiaojuan"},{"family":"Yuan","given":"Wenping"}],"issued":{"date-parts":[[2026,5,11]]},"accessed":{"date-parts":[[2026,10,4]]},"container-title":"Scientific Data","volume":"13","issue":"1","page":"1074","DOI":"10.1038/s41597-026-07370-5","URL":"https://www.nature.com/articles/s41597-026-07370-5","note":"PublishedNature-familyDataDescriptorverifiedfromexistingpublisherHTMLcitationmetadata;DataRecordsidentifiessameScienceDataBankdataset. Snapshot CCD2026_Nature_publisher.html SHA-256 b93d7b665293aa3d8393bfb50b187c9c1cc756e2ba00f6bd46c1f628d7871c20."}}],"schema":"https://github.com/citation-style-language/schema/raw/master/csl-citation.json"} </w:instrText>
+        <w:instrText xml:space="preserve"> ADDIN ZOTERO_ITEM CSL_CITATION {"citationID":"7816396b63e420ac","properties":{"formattedCitation":"(Fu et al., 2026; Fu et al., 2025)","plainCitation":"(Fu et al., 2026; Fu et al., 2025)","noteIndex":0},"citationItems":[{"id":"fu2025_ccd_dataset","itemData":{"id":"fu2025_ccd_dataset","type":"dataset","title":"China Crop Dataset: A long-term and high-resolution crop distribution dataset in China","author":[{"given":"Yangyang","family":"Fu"},{"given":"Jie","family":"Dong"},{"given":"Ruoque","family":"Shen"},{"given":"Qiongyan","family":"Peng"},{"given":"Xiangqian","family":"Li"},{"given":"Yi","family":"Zheng"},{"given":"Baihong","family":"Pan"},{"given":"Jinwei","family":"Dong"},{"given":"Bingwen","family":"Qiu"},{"given":"Jianxi","family":"Huang"},{"given":"Wenping","family":"Yuan"}],"issued":{"date-parts":[[2025,11,28]]},"accessed":{"date-parts":[[2026,10,4]]},"publisher":"Science Data Bank","version":"1.0.0 (repository citationV1)","DOI":"10.57760/sciencedb.32361","URL":"https://doi.org/10.57760/sciencedb.32361","note":"Datasetidentityverifiedfromexistingofficialrepositorymetadata.30mChinaCropDataset2001–2024;class9=winterwheat–maizerotation. The2020layerincomparisonispartofthisdataset,notCCD-Maize-only. Snapshot CCD_repository_metadata.json SHA-256 205dbd2ca8692b8ff4605df6ae110d71b0ff5a2a6aef9bb3052bcb3e8c34912e."}},{"id":"fu2026_ccd_descriptor","itemData":{"id":"fu2026_ccd_descriptor","type":"article-journal","title":"A 30-m annual distribution dataset of major crops in China from 2001-2024","author":[{"family":"Fu","given":"Yangyang"},{"family":"Dong","given":"Jie"},{"family":"Shen","given":"Ruoque"},{"family":"Peng","given":"Qiongyan"},{"family":"Li","given":"Xiangqian"},{"family":"Zheng","given":"Yi"},{"family":"Pan","given":"Baihong"},{"family":"Dong","given":"Jinwei"},{"family":"Qiu","given":"Bingwen"},{"family":"Huang","given":"Jianxi"},{"family":"Huang","given":"Xiaojuan"},{"family":"Yuan","given":"Wenping"}],"issued":{"date-parts":[[2026,5,11]]},"accessed":{"date-parts":[[2026,10,4]]},"container-title":"Scientific Data","volume":"13","issue":"1","page":"1074","DOI":"10.1038/s41597-026-07370-5","URL":"https://www.nature.com/articles/s41597-026-07370-5","note":"PublishedNature-familyDataDescriptorverifiedfromexistingpublisherHTMLcitationmetadata;DataRecordsidentifiessameScienceDataBankdataset. Snapshot CCD2026_Nature_publisher.html SHA-256 b93d7b665293aa3d8393bfb50b187c9c1cc756e2ba00f6bd46c1f628d7871c20."}}],"schema":"https://github.com/citation-style-language/schema/raw/master/csl-citation.json"} </w:instrText>
       </w:r>
       <w:r>
         <w:fldChar w:fldCharType="separate"/>
@@ -13137,6 +13287,94 @@
       </w:pPr>
       <w:r>
         <w:t>All printed seasonal ET targets remain eligible after matching the 2016 maize rainfall period. Maize-season rainfall of 499.1 mm excludes the 100.5 mm during wheat from the 599.6-mm rotation total. Reconstructed balance residuals for W0–W3 are +0.1, +0.1, −0.9 and +0.1 mm. Source ET and depletion values remain unchanged. Storage-depletion diagnostics share the source ET balance and its unconfirmed exact sampling dates; they are conditional accounting comparisons rather than independent soil-water validation.</w:t>
+      </w:r>
+    </w:p>
+    <w:p>
+      <w:pPr>
+        <w:spacing w:line="480" w:lineRule="auto"/>
+      </w:pPr>
+      <w:r>
+        <w:t xml:space="preserve">Field simulations retain the recorded irrigation, sowing and harvest dates and archived daily weather. Wheat crop-start storage follows the pre-sowing simulation, whereas maize is initialized separately from observed treatment-specific total storage in 2 m; its distribution among layers is assumed. Field capacity, wilting point and bulk density are transferred from the published Luancheng profile, with the bottom 10 cm extrapolated </w:t>
+      </w:r>
+      <w:r>
+        <w:fldChar w:fldCharType="begin"/>
+      </w:r>
+      <w:r>
+        <w:instrText xml:space="preserve"> ADDIN ZOTERO_ITEM CSL_CITATION {"citationID":"73c7facab1ec77aa","properties":{"formattedCitation":"(Sun et al., 2006)","plainCitation":"(Sun et al., 2006)","noteIndex":0},"citationItems":[{"id":"sun2006_water_balance","itemData":{"id":"sun2006_water_balance","type":"article-journal","title":"Effects of irrigation on water balance, yield and WUE of winter wheat in the North China Plain","author":[{"family":"Sun","given":"Hong-Yong"},{"family":"Liu","given":"Chang-Ming"},{"family":"Zhang","given":"Xi-Ying"},{"family":"Shen","given":"Yan-Jun"},{"family":"Zhang","given":"Yong-Qiang"}],"issued":{"date-parts":[[2006,9]]},"container-title":"Agricultural Water Management","container-title-short":"Agric. Water Manag.","volume":"85","DOI":"10.1016/j.agwat.2006.04.008","URL":"https://doi.org/10.1016/j.agwat.2006.04.008","accessed":{"date-parts":[[2026,10,3]]},"language":"en","publisher":"Elsevier BV","issue":"1-2","page":"211-218"}}],"schema":"https://github.com/citation-style-language/schema/raw/master/csl-citation.json"} </w:instrText>
+      </w:r>
+      <w:r>
+        <w:fldChar w:fldCharType="separate"/>
+      </w:r>
+      <w:r>
+        <w:t>(Sun et al., 2006)</w:t>
+      </w:r>
+      <w:r>
+        <w:fldChar w:fldCharType="end"/>
+      </w:r>
+      <w:r>
+        <w:t xml:space="preserve">. Conductivity follows the SoilGrids–Saxton–Rawls prior </w:t>
+      </w:r>
+      <w:r>
+        <w:fldChar w:fldCharType="begin"/>
+      </w:r>
+      <w:r>
+        <w:instrText xml:space="preserve"> ADDIN ZOTERO_ITEM CSL_CITATION {"citationID":"bc23b03b04d1a6d3","properties":{"formattedCitation":"(ISRIC — World Soil Information, 2020; Saxton and Rawls, 2006)","plainCitation":"(ISRIC — World Soil Information, 2020; Saxton and Rawls, 2006)","noteIndex":0},"citationItems":[{"id":"soilgrids2020_dataset","itemData":{"id":"soilgrids2020_dataset","type":"dataset","title":"SoilGrids250m version 2.0","author":[{"literal":"ISRIC — World Soil Information"}],"issued":{"date-parts":[[2020]]},"URL":"https://docs.isric.org/globaldata/soilgrids/SoilGrids_faqs.html"}},{"id":"saxton2006_hydraulics","itemData":{"id":"saxton2006_hydraulics","type":"article-journal","title":"Soil Water Characteristic Estimates by Texture and Organic Matter for Hydrologic Solutions","author":[{"family":"Saxton","given":"K. E."},{"family":"Rawls","given":"W. J."}],"container-title":"Soil Science Society of America Journal","volume":"70","issue":"5","page":"1569-1578","issued":{"date-parts":[[2006,9,1]]},"accessed":{"date-parts":[[2026,10,3]]},"DOI":"10.2136/sssaj2005.0117","URL":"https://acsess.onlinelibrary.wiley.com/doi/10.2136/sssaj2005.0117","note":"Publisher title/authors/date/volume/issue/pages and Crossref DOI metadata verified 2026-10-03. Publisher publication date2006-09-01; Crossref records2006-09. Source supports texture/organic-matter pedotransfer estimates, not verified site-specific hydraulic measurements."}}],"schema":"https://github.com/citation-style-language/schema/raw/master/csl-citation.json"} </w:instrText>
+      </w:r>
+      <w:r>
+        <w:fldChar w:fldCharType="separate"/>
+      </w:r>
+      <w:r>
+        <w:t>(ISRIC — World Soil Information, 2020; Saxton and Rawls, 2006)</w:t>
+      </w:r>
+      <w:r>
+        <w:fldChar w:fldCharType="end"/>
+      </w:r>
+      <w:r>
+        <w:t xml:space="preserve">, with a particle-density prior of 2.75 g cm⁻³. Reported wheat-straw mulch has no measured cover fraction, so maize retains the exposed-soil evaporation boundary </w:t>
+      </w:r>
+      <w:r>
+        <w:fldChar w:fldCharType="begin"/>
+      </w:r>
+      <w:r>
+        <w:instrText xml:space="preserve"> ADDIN ZOTERO_ITEM CSL_CITATION {"citationID":"128b3fad70d8546b","properties":{"formattedCitation":"(Yang et al., 2024)","plainCitation":"(Yang et al., 2024)","noteIndex":0},"citationItems":[{"id":"yang2024_precipitation","itemData":{"id":"yang2024_precipitation","type":"article-journal","title":"Optimal irrigation for wheat-maize rotation depending on precipitation in the North China Plain: Evidence from a four-year experiment","author":[{"family":"Yang","given":"Lei"},{"family":"Fang","given":"Xiangyang"},{"family":"Zhou","given":"Jie"},{"family":"Zhao","given":"Jie"},{"family":"Hou","given":"Xiqing"},{"family":"Yang","given":"Yadong"},{"family":"Zang","given":"Huadong"},{"family":"Zeng","given":"Zhaohai"}],"issued":{"date-parts":[[2024,4]]},"container-title":"Agricultural Water Management","container-title-short":"Agric. Water Manag.","volume":"294","DOI":"10.1016/j.agwat.2024.108726","URL":"https://doi.org/10.1016/j.agwat.2024.108726","accessed":{"date-parts":[[2026,10,3]]},"language":"en","publisher":"Elsevier BV","page":"108726"}}],"schema":"https://github.com/citation-style-language/schema/raw/master/csl-citation.json"} </w:instrText>
+      </w:r>
+      <w:r>
+        <w:fldChar w:fldCharType="separate"/>
+      </w:r>
+      <w:r>
+        <w:t>(Yang et al., 2024)</w:t>
+      </w:r>
+      <w:r>
+        <w:fldChar w:fldCharType="end"/>
+      </w:r>
+      <w:r>
+        <w:t>. The model represents runoff and drainage, which the published ET balance assumes negligible.</w:t>
+      </w:r>
+    </w:p>
+    <w:p>
+      <w:pPr>
+        <w:spacing w:line="480" w:lineRule="auto"/>
+      </w:pPr>
+      <w:r>
+        <w:t xml:space="preserve">Harvest aboveground biomass comprises grain and residues cut at ground level and oven-dried to constant mass, requiring no moisture adjustment. Annual grain means and standard errors digitized from source Supplementary Figure S2 are reconciled with its eight printed four-year means </w:t>
+      </w:r>
+      <w:r>
+        <w:fldChar w:fldCharType="begin"/>
+      </w:r>
+      <w:r>
+        <w:instrText xml:space="preserve"> ADDIN ZOTERO_ITEM CSL_CITATION {"citationID":"fb732a2c704ff616","properties":{"formattedCitation":"(Yang et al., 2024)","plainCitation":"(Yang et al., 2024)","noteIndex":0},"citationItems":[{"id":"yang2024_precipitation","itemData":{"id":"yang2024_precipitation","type":"article-journal","title":"Optimal irrigation for wheat-maize rotation depending on precipitation in the North China Plain: Evidence from a four-year experiment","author":[{"family":"Yang","given":"Lei"},{"family":"Fang","given":"Xiangyang"},{"family":"Zhou","given":"Jie"},{"family":"Zhao","given":"Jie"},{"family":"Hou","given":"Xiqing"},{"family":"Yang","given":"Yadong"},{"family":"Zang","given":"Huadong"},{"family":"Zeng","given":"Zhaohai"}],"issued":{"date-parts":[[2024,4]]},"container-title":"Agricultural Water Management","container-title-short":"Agric. Water Manag.","volume":"294","DOI":"10.1016/j.agwat.2024.108726","URL":"https://doi.org/10.1016/j.agwat.2024.108726","accessed":{"date-parts":[[2026,10,3]]},"language":"en","publisher":"Elsevier BV","page":"108726"}}],"schema":"https://github.com/citation-style-language/schema/raw/master/csl-citation.json"} </w:instrText>
+      </w:r>
+      <w:r>
+        <w:fldChar w:fldCharType="separate"/>
+      </w:r>
+      <w:r>
+        <w:t>(Yang et al., 2024)</w:t>
+      </w:r>
+      <w:r>
+        <w:fldChar w:fldCharType="end"/>
+      </w:r>
+      <w:r>
+        <w:t>. Pixel tolerances are approximately 0.043 t ha⁻¹ for wheat and 0.056 t ha⁻¹ for maize. Observed grain is multiplied once by 0.87 for dry-matter fitting, and simulated dry grain is divided by 0.87 for comparison at 13% moisture. Annual and four-year means overlap and provide no additional independent observations.</w:t>
       </w:r>
     </w:p>
     <w:p>
@@ -18266,7 +18504,7 @@
         <w:spacing w:line="480" w:lineRule="auto"/>
       </w:pPr>
       <w:r>
-        <w:t>Figure S6. Site-specific wheat LAI comparisons: (a) Fengqiu; (b) Luancheng; (c) Shangqiu; (d) Yucheng. Calibration and retrospective-evaluation observations and simulations share the same axes within each site. Error bars describe site-year standard errors; gaps are retained. The observations, weighting and conditional management interpretation follow Figure 5.</w:t>
+        <w:t>Figure S6. Site-specific wheat LAI comparisons: (a) Fengqiu; (b) Luancheng; (c) Shangqiu; (d) Yucheng. Calibration and retrospective-evaluation observations and simulations share the same axes within each site. Error bars describe site-year standard errors; gaps are retained. The observations, weighting and conditional management interpretation follow Figure 6.</w:t>
       </w:r>
     </w:p>
     <w:p>
@@ -18317,7 +18555,7 @@
         <w:spacing w:line="480" w:lineRule="auto"/>
       </w:pPr>
       <w:r>
-        <w:t>Figure S7. Site-specific wheat aboveground biomass comparisons: (a) Fengqiu; (b) Luancheng; (c) Shangqiu; (d) Yucheng. Calibration and retrospective-evaluation observations and simulations share the same axes within each site. Error bars describe site-year standard errors; gaps are retained. The observations, weighting and conditional management interpretation follow Figure 5.</w:t>
+        <w:t>Figure S7. Site-specific wheat aboveground biomass comparisons: (a) Fengqiu; (b) Luancheng; (c) Shangqiu; (d) Yucheng. Calibration and retrospective-evaluation observations and simulations share the same axes within each site. Error bars describe site-year standard errors; gaps are retained. The observations, weighting and conditional management interpretation follow Figure 6.</w:t>
       </w:r>
     </w:p>
     <w:p>
@@ -18368,7 +18606,7 @@
         <w:spacing w:line="480" w:lineRule="auto"/>
       </w:pPr>
       <w:r>
-        <w:t>Figure S8. Site-specific wheat ET comparisons: (a) Fengqiu; (b) Yucheng. Calibration and retrospective-evaluation observations and simulations share the same axes within each site. Error bars describe site-year standard errors; gaps are retained. The observations, weighting and conditional management interpretation follow Figure 5.</w:t>
+        <w:t>Figure S8. Site-specific wheat ET comparisons: (a) Fengqiu; (b) Yucheng. Calibration and retrospective-evaluation observations and simulations share the same axes within each site. Error bars describe site-year standard errors; gaps are retained. The observations, weighting and conditional management interpretation follow Figure 6.</w:t>
       </w:r>
     </w:p>
     <w:p>
@@ -18419,7 +18657,7 @@
         <w:spacing w:line="480" w:lineRule="auto"/>
       </w:pPr>
       <w:r>
-        <w:t>Figure S9. Site-specific maize LAI comparisons: (a) Fengqiu; (b) Gucheng; (c) Luancheng; (d) Shangqiu; (e) Yucheng. Calibration and retrospective-evaluation observations and simulations share the same axes within each site. Error bars describe site-year standard errors; gaps are retained. The observations, weighting and conditional management interpretation follow Figure 5.</w:t>
+        <w:t>Figure S9. Site-specific maize LAI comparisons: (a) Fengqiu; (b) Gucheng; (c) Luancheng; (d) Shangqiu; (e) Yucheng. Calibration and retrospective-evaluation observations and simulations share the same axes within each site. Error bars describe site-year standard errors; gaps are retained. The observations, weighting and conditional management interpretation follow Figure 6.</w:t>
       </w:r>
     </w:p>
     <w:p>
@@ -18470,7 +18708,7 @@
         <w:spacing w:line="480" w:lineRule="auto"/>
       </w:pPr>
       <w:r>
-        <w:t>Figure S10. Site-specific maize aboveground biomass comparisons: (a) Fengqiu; (b) Luancheng; (c) Shangqiu; (d) Yucheng. Calibration and retrospective-evaluation observations and simulations share the same axes within each site. Error bars describe site-year standard errors; gaps are retained. The observations, weighting and conditional management interpretation follow Figure 5.</w:t>
+        <w:t>Figure S10. Site-specific maize aboveground biomass comparisons: (a) Fengqiu; (b) Luancheng; (c) Shangqiu; (d) Yucheng. Calibration and retrospective-evaluation observations and simulations share the same axes within each site. Error bars describe site-year standard errors; gaps are retained. The observations, weighting and conditional management interpretation follow Figure 6.</w:t>
       </w:r>
     </w:p>
     <w:p>
@@ -18521,7 +18759,7 @@
         <w:spacing w:line="480" w:lineRule="auto"/>
       </w:pPr>
       <w:r>
-        <w:t>Figure S11. Site-specific maize ET comparisons: (a) Fengqiu; (b) Yucheng. Calibration and retrospective-evaluation observations and simulations share the same axes within each site. Error bars describe site-year standard errors; gaps are retained. The observations, weighting and conditional management interpretation follow Figure 5.</w:t>
+        <w:t>Figure S11. Site-specific maize ET comparisons: (a) Fengqiu; (b) Yucheng. Calibration and retrospective-evaluation observations and simulations share the same axes within each site. Error bars describe site-year standard errors; gaps are retained. The observations, weighting and conditional management interpretation follow Figure 6.</w:t>
       </w:r>
     </w:p>
     <w:p>
@@ -18547,6 +18785,105 @@
       <w:r>
         <w:fldChar w:fldCharType="separate"/>
       </w:r>
+      <w:r>
+        <w:t>Fengqiu Station, 2020a. Crop phenology and growth dynamics at Fengqiu Station, Henan Province, 2004–2008. https://doi.org/10.12199/nesdc.ecodb.mon.2020.dp2011.fqa.002</w:t>
+      </w:r>
+    </w:p>
+    <w:p>
+      <w:pPr>
+        <w:spacing w:line="480" w:lineRule="auto"/>
+        <w:ind w:left="288" w:hanging="288"/>
+      </w:pPr>
+      <w:r>
+        <w:t>Luancheng Station, 2020. Crop phenology and growth dynamics at Luancheng Station, Hebei Province, 2000–2008. https://doi.org/10.12199/nesdc.ecodb.mon.2020.dp2011.lca.002</w:t>
+      </w:r>
+    </w:p>
+    <w:p>
+      <w:pPr>
+        <w:spacing w:line="480" w:lineRule="auto"/>
+        <w:ind w:left="288" w:hanging="288"/>
+      </w:pPr>
+      <w:r>
+        <w:t>Shangqiu Station, 2021. Crop phenology and growth dynamics at Shangqiu Station, Henan Province, 2000–2007. https://doi.org/10.12199/nesdc.ecodb.mon.2020.dp2011.sqa.003</w:t>
+      </w:r>
+    </w:p>
+    <w:p>
+      <w:pPr>
+        <w:spacing w:line="480" w:lineRule="auto"/>
+        <w:ind w:left="288" w:hanging="288"/>
+      </w:pPr>
+      <w:r>
+        <w:t>Geng, J., Zhou, G., Song, Y., Ren, S., Zhao, H., Zhou, H., Song, X., Tian, X., 2023. A dataset of effects of different sowing dates on maize growth and development in the northern part of North China from 2018 to 2021. https://doi.org/10.57760/sciencedb.o00119.00017</w:t>
+      </w:r>
+    </w:p>
+    <w:p>
+      <w:pPr>
+        <w:spacing w:line="480" w:lineRule="auto"/>
+        <w:ind w:left="288" w:hanging="288"/>
+      </w:pPr>
+      <w:r>
+        <w:t>Yucheng Station, 2021. Crop phenology and growth dynamics at Yucheng Station, Shandong Province, 1998–2006. https://doi.org/10.12199/nesdc.ecodb.mon.2020.dp2011.yca.003</w:t>
+      </w:r>
+    </w:p>
+    <w:p>
+      <w:pPr>
+        <w:spacing w:line="480" w:lineRule="auto"/>
+        <w:ind w:left="288" w:hanging="288"/>
+      </w:pPr>
+      <w:r>
+        <w:t>Yucheng Station, 2025a. Biological observations at Yucheng Station, 2005–2022. https://doi.org/10.12199/nesdc.ecodb.2021YFF0703900.yca.2025.2</w:t>
+      </w:r>
+    </w:p>
+    <w:p>
+      <w:pPr>
+        <w:spacing w:line="480" w:lineRule="auto"/>
+        <w:ind w:left="288" w:hanging="288"/>
+      </w:pPr>
+      <w:r>
+        <w:t>Yucheng Station, 2025b. Water-environment observations at Yucheng Station, 2005–2022. https://doi.org/10.12199/nesdc.ecodb.2021YFF0703900.yca.2025.3</w:t>
+      </w:r>
+    </w:p>
+    <w:p>
+      <w:pPr>
+        <w:spacing w:line="480" w:lineRule="auto"/>
+        <w:ind w:left="288" w:hanging="288"/>
+      </w:pPr>
+      <w:r>
+        <w:t>Fengqiu Station, 2020b. Farmland soil-water physical properties at Fengqiu Station, Henan Province, 2005–2008. https://doi.org/10.12199/nesdc.ecodb.mon.2020.dp2011.fqa.006</w:t>
+      </w:r>
+    </w:p>
+    <w:p>
+      <w:pPr>
+        <w:spacing w:line="480" w:lineRule="auto"/>
+        <w:ind w:left="288" w:hanging="288"/>
+      </w:pPr>
+      <w:r>
+        <w:t>Chen, C., Wang, E., Yu, Q., 2010. Modeling Wheat and Maize Productivity as Affected by Climate Variation and Irrigation Supply in North China Plain. Agronomy Journal 102, 1037–1049. https://doi.org/10.2134/agronj2009.0505</w:t>
+      </w:r>
+    </w:p>
+    <w:p>
+      <w:pPr>
+        <w:spacing w:line="480" w:lineRule="auto"/>
+        <w:ind w:left="288" w:hanging="288"/>
+      </w:pPr>
+      <w:r>
+        <w:t>Yu, Q., Saseendran, S.A., Ma, L., Flerchinger, G.N., Green, T.R., Ahuja, L.R., 2006. Modeling a wheat–maize double cropping system in China using two plant growth modules in RZWQM. Agricultural Systems 89, 457–477. https://doi.org/10.1016/j.agsy.2005.10.009</w:t>
+      </w:r>
+    </w:p>
+    <w:p>
+      <w:pPr>
+        <w:spacing w:line="480" w:lineRule="auto"/>
+        <w:ind w:left="288" w:hanging="288"/>
+      </w:pPr>
+      <w:r>
+        <w:t>Wang, M., Shi, W., 2024. The annual dynamic dataset of high-resolution crop water use in China from 1991 to 2019. Scientific Data 11, 1373. https://doi.org/10.1038/s41597-024-04185-0</w:t>
+      </w:r>
+    </w:p>
+    <w:p>
+      <w:pPr>
+        <w:spacing w:line="480" w:lineRule="auto"/>
+        <w:ind w:left="288" w:hanging="288"/>
+      </w:pPr>
       <w:r>
         <w:t>Yang, L., Fang, X., Zhou, J., Zhao, J., Hou, X., Yang, Y., Zang, H., Zeng, Z., 2024. Optimal irrigation for wheat-maize rotation depending on precipitation in the North China Plain: Evidence from a four-year experiment. Agric. Water Manag. 294, 108726. https://doi.org/10.1016/j.agwat.2024.108726</w:t>
       </w:r>
@@ -18702,6 +19039,15 @@
       </w:pPr>
       <w:r>
         <w:t>Fu, Y., Dong, J., Shen, R., Peng, Q., Li, X., Zheng, Y., Pan, B., Dong, J., Qiu, B., Huang, J., Huang, X., Yuan, W., 2026. A 30-m annual distribution dataset of major crops in China from 2001-2024. Scientific Data 13, 1074. https://doi.org/10.1038/s41597-026-07370-5</w:t>
+      </w:r>
+    </w:p>
+    <w:p>
+      <w:pPr>
+        <w:spacing w:line="480" w:lineRule="auto"/>
+        <w:ind w:left="288" w:hanging="288"/>
+      </w:pPr>
+      <w:r>
+        <w:t>Sun, H.-Y., Liu, C.-M., Zhang, X.-Y., Shen, Y.-J., Zhang, Y.-Q., 2006. Effects of irrigation on water balance, yield and WUE of winter wheat in the North China Plain. Agric. Water Manag. 85, 211–218. https://doi.org/10.1016/j.agwat.2006.04.008</w:t>
       </w:r>
       <w:r>
         <w:fldChar w:fldCharType="end"/>

</xml_diff>